<commit_message>
feat: APG formletter extended with self organized committee texts #BKDO-3821
</commit_message>
<xml_diff>
--- a/src/Bk.APG.Api/Templates/FormLetterGeneralElection_French.docx
+++ b/src/Bk.APG.Api/Templates/FormLetterGeneralElection_French.docx
@@ -951,15 +951,29 @@
     <w:p>
       <w:pPr>
         <w:rPr>
-          <w:lang w:val="fr-CH"/>
-        </w:rPr>
-      </w:pPr>
-      <w:r>
-        <w:rPr>
-          <w:highlight w:val="yellow"/>
-          <w:lang w:val="fr-CH"/>
-        </w:rPr>
-        <w:t>&lt;&lt;if [member.formLetterType == 0]&gt;&gt;</w:t>
+          <w:lang w:val="en-US"/>
+        </w:rPr>
+      </w:pPr>
+      <w:r>
+        <w:rPr>
+          <w:highlight w:val="yellow"/>
+          <w:lang w:val="en-US"/>
+        </w:rPr>
+        <w:t>&lt;&lt;if [member.formLetterType == 0 &amp;&amp; member.selfOrganized == fa</w:t>
+      </w:r>
+      <w:r>
+        <w:rPr>
+          <w:highlight w:val="yellow"/>
+          <w:lang w:val="en-US"/>
+        </w:rPr>
+        <w:t>lse</w:t>
+      </w:r>
+      <w:r>
+        <w:rPr>
+          <w:highlight w:val="yellow"/>
+          <w:lang w:val="en-US"/>
+        </w:rPr>
+        <w:t>]&gt;&gt;</w:t>
       </w:r>
     </w:p>
     <w:p>
@@ -1146,13 +1160,13 @@
     <w:p>
       <w:pPr>
         <w:rPr>
-          <w:lang w:val="fr-CH"/>
-        </w:rPr>
-      </w:pPr>
-      <w:r>
-        <w:rPr>
-          <w:highlight w:val="yellow"/>
-          <w:lang w:val="fr-CH"/>
+          <w:lang w:val="en-US"/>
+        </w:rPr>
+      </w:pPr>
+      <w:r>
+        <w:rPr>
+          <w:highlight w:val="yellow"/>
+          <w:lang w:val="en-US"/>
         </w:rPr>
         <w:t>&lt;&lt;/if&gt;&gt;</w:t>
       </w:r>
@@ -1160,15 +1174,249 @@
     <w:p>
       <w:pPr>
         <w:rPr>
-          <w:lang w:val="fr-CH"/>
-        </w:rPr>
-      </w:pPr>
-      <w:r>
-        <w:rPr>
-          <w:highlight w:val="yellow"/>
-          <w:lang w:val="fr-CH"/>
-        </w:rPr>
-        <w:t>&lt;&lt;if [member.formLetterType == 1]&gt;&gt;</w:t>
+          <w:lang w:val="en-US"/>
+        </w:rPr>
+      </w:pPr>
+      <w:r>
+        <w:rPr>
+          <w:highlight w:val="yellow"/>
+          <w:lang w:val="en-US"/>
+        </w:rPr>
+        <w:t xml:space="preserve">&lt;&lt;if [member.formLetterType == 0 &amp;&amp; member.selfOrganized == </w:t>
+      </w:r>
+      <w:r>
+        <w:rPr>
+          <w:highlight w:val="yellow"/>
+          <w:lang w:val="en-US"/>
+        </w:rPr>
+        <w:t>true</w:t>
+      </w:r>
+      <w:r>
+        <w:rPr>
+          <w:highlight w:val="yellow"/>
+          <w:lang w:val="en-US"/>
+        </w:rPr>
+        <w:t>]&gt;&gt;</w:t>
+      </w:r>
+    </w:p>
+    <w:p>
+      <w:pPr>
+        <w:rPr>
+          <w:lang w:val="fr-CH"/>
+        </w:rPr>
+      </w:pPr>
+      <w:r>
+        <w:rPr>
+          <w:lang w:val="fr-CH"/>
+        </w:rPr>
+        <w:t>Il vous annonce votre nomination au sein de l’organe suivant:</w:t>
+      </w:r>
+    </w:p>
+    <w:p>
+      <w:pPr>
+        <w:rPr>
+          <w:lang w:val="fr-CH"/>
+        </w:rPr>
+      </w:pPr>
+    </w:p>
+    <w:p>
+      <w:pPr>
+        <w:rPr>
+          <w:b/>
+          <w:bCs/>
+          <w:lang w:val="fr-CH"/>
+        </w:rPr>
+      </w:pPr>
+      <w:r>
+        <w:rPr>
+          <w:b/>
+          <w:bCs/>
+          <w:lang w:val="fr-CH"/>
+        </w:rPr>
+        <w:t>&lt;&lt;[member.committeeName]&gt;&gt;</w:t>
+      </w:r>
+    </w:p>
+    <w:p>
+      <w:pPr>
+        <w:rPr>
+          <w:bCs/>
+          <w:lang w:val="fr-CH"/>
+        </w:rPr>
+      </w:pPr>
+    </w:p>
+    <w:p>
+      <w:pPr>
+        <w:rPr>
+          <w:bCs/>
+          <w:lang w:val="fr-CH"/>
+        </w:rPr>
+      </w:pPr>
+      <w:r>
+        <w:rPr>
+          <w:bCs/>
+          <w:lang w:val="fr-CH"/>
+        </w:rPr>
+        <w:t>Les fonctions au sein de cet organe seront déterminées selon les règles qui lui sont applicables.</w:t>
+      </w:r>
+    </w:p>
+    <w:p>
+      <w:pPr>
+        <w:rPr>
+          <w:bCs/>
+          <w:lang w:val="fr-CH"/>
+        </w:rPr>
+      </w:pPr>
+    </w:p>
+    <w:p>
+      <w:pPr>
+        <w:rPr>
+          <w:bCs/>
+          <w:lang w:val="fr-CH"/>
+        </w:rPr>
+      </w:pPr>
+      <w:r>
+        <w:rPr>
+          <w:bCs/>
+          <w:lang w:val="fr-CH"/>
+        </w:rPr>
+        <w:t xml:space="preserve">Les informations vous concernant sont saisies dans la banque de données pertinente. La Chancellerie fédérale publie cette banque de données à l’adresse </w:t>
+      </w:r>
+      <w:hyperlink r:id="rId9" w:tooltip="http://www.admin.ch" w:history="1">
+        <w:r>
+          <w:rPr>
+            <w:rStyle w:val="Hyperlink"/>
+            <w:bCs/>
+            <w:i/>
+            <w:iCs/>
+            <w:lang w:val="fr-CH"/>
+          </w:rPr>
+          <w:t>http://www.admin.ch</w:t>
+        </w:r>
+      </w:hyperlink>
+      <w:r>
+        <w:rPr>
+          <w:bCs/>
+          <w:i/>
+          <w:iCs/>
+          <w:lang w:val="fr-CH"/>
+        </w:rPr>
+        <w:t xml:space="preserve"> </w:t>
+      </w:r>
+      <w:r>
+        <w:rPr>
+          <w:bCs/>
+          <w:i/>
+          <w:iCs/>
+          <w:lang w:val="fr-CH"/>
+        </w:rPr>
+        <w:t>&gt; Administration fédérale &gt; Commissions extraparlementaires</w:t>
+      </w:r>
+      <w:r>
+        <w:rPr>
+          <w:bCs/>
+          <w:lang w:val="fr-CH"/>
+        </w:rPr>
+        <w:t xml:space="preserve"> de façon à garantir la transparence requise s’agissant de la composition des commissions (art. 8</w:t>
+      </w:r>
+      <w:r>
+        <w:rPr>
+          <w:bCs/>
+          <w:i/>
+          <w:iCs/>
+          <w:lang w:val="fr-CH"/>
+        </w:rPr>
+        <w:t>k</w:t>
+      </w:r>
+      <w:r>
+        <w:rPr>
+          <w:bCs/>
+          <w:lang w:val="fr-CH"/>
+        </w:rPr>
+        <w:t xml:space="preserve"> de l’ordonnance sur l’organisation du gouvernement et de l’administration; RS 172.010.1).</w:t>
+      </w:r>
+    </w:p>
+    <w:p>
+      <w:pPr>
+        <w:rPr>
+          <w:bCs/>
+          <w:lang w:val="fr-CH"/>
+        </w:rPr>
+      </w:pPr>
+    </w:p>
+    <w:p>
+      <w:pPr>
+        <w:rPr>
+          <w:lang w:val="fr-CH"/>
+        </w:rPr>
+      </w:pPr>
+      <w:r>
+        <w:rPr>
+          <w:lang w:val="fr-CH"/>
+        </w:rPr>
+        <w:t>Au nom du Conseil fédéral, je vous adresse mes sincères félicitations pour cette nomination et je vous souhaite plein succès et beaucoup de satisfaction dans vos nouvelles fonctions.</w:t>
+      </w:r>
+    </w:p>
+    <w:p>
+      <w:pPr>
+        <w:rPr>
+          <w:lang w:val="en-US"/>
+        </w:rPr>
+      </w:pPr>
+      <w:r>
+        <w:rPr>
+          <w:highlight w:val="yellow"/>
+          <w:lang w:val="en-US"/>
+        </w:rPr>
+        <w:t>&lt;&lt;/if&gt;&gt;</w:t>
+      </w:r>
+    </w:p>
+    <w:p>
+      <w:pPr>
+        <w:rPr>
+          <w:lang w:val="en-US"/>
+        </w:rPr>
+      </w:pPr>
+      <w:r>
+        <w:rPr>
+          <w:highlight w:val="yellow"/>
+          <w:lang w:val="en-US"/>
+        </w:rPr>
+        <w:t>&lt;&lt;if [member.formLetterType == 1</w:t>
+      </w:r>
+      <w:r>
+        <w:rPr>
+          <w:highlight w:val="yellow"/>
+          <w:lang w:val="en-US"/>
+        </w:rPr>
+        <w:t xml:space="preserve"> </w:t>
+      </w:r>
+      <w:r>
+        <w:rPr>
+          <w:highlight w:val="yellow"/>
+          <w:lang w:val="en-US"/>
+        </w:rPr>
+        <w:t xml:space="preserve">&amp;&amp; member.selfOrganized == </w:t>
+      </w:r>
+      <w:r>
+        <w:rPr>
+          <w:highlight w:val="yellow"/>
+          <w:lang w:val="en-US"/>
+        </w:rPr>
+        <w:t>false</w:t>
+      </w:r>
+      <w:r>
+        <w:rPr>
+          <w:highlight w:val="yellow"/>
+          <w:lang w:val="en-US"/>
+        </w:rPr>
+        <w:t>]</w:t>
+      </w:r>
+      <w:r>
+        <w:rPr>
+          <w:highlight w:val="yellow"/>
+          <w:lang w:val="en-US"/>
+        </w:rPr>
+        <w:t>&gt;&gt;</w:t>
       </w:r>
     </w:p>
     <w:p>
@@ -1282,15 +1530,148 @@
     <w:p>
       <w:pPr>
         <w:rPr>
-          <w:lang w:val="fr-CH"/>
-        </w:rPr>
-      </w:pPr>
-      <w:r>
-        <w:rPr>
-          <w:highlight w:val="yellow"/>
-          <w:lang w:val="fr-CH"/>
-        </w:rPr>
-        <w:lastRenderedPageBreak/>
+          <w:lang w:val="en-US"/>
+        </w:rPr>
+      </w:pPr>
+      <w:r>
+        <w:rPr>
+          <w:highlight w:val="yellow"/>
+          <w:lang w:val="en-US"/>
+        </w:rPr>
+        <w:t>&lt;&lt;if [member.formLetterType == 1</w:t>
+      </w:r>
+      <w:r>
+        <w:rPr>
+          <w:highlight w:val="yellow"/>
+          <w:lang w:val="en-US"/>
+        </w:rPr>
+        <w:t xml:space="preserve"> </w:t>
+      </w:r>
+      <w:r>
+        <w:rPr>
+          <w:highlight w:val="yellow"/>
+          <w:lang w:val="en-US"/>
+        </w:rPr>
+        <w:t xml:space="preserve">&amp;&amp; member.selfOrganized == </w:t>
+      </w:r>
+      <w:r>
+        <w:rPr>
+          <w:highlight w:val="yellow"/>
+          <w:lang w:val="en-US"/>
+        </w:rPr>
+        <w:t>true</w:t>
+      </w:r>
+      <w:r>
+        <w:rPr>
+          <w:highlight w:val="yellow"/>
+          <w:lang w:val="en-US"/>
+        </w:rPr>
+        <w:t>]</w:t>
+      </w:r>
+      <w:r>
+        <w:rPr>
+          <w:highlight w:val="yellow"/>
+          <w:lang w:val="en-US"/>
+        </w:rPr>
+        <w:t>&gt;&gt;</w:t>
+      </w:r>
+    </w:p>
+    <w:p>
+      <w:pPr>
+        <w:rPr>
+          <w:rFonts w:cs="Arial"/>
+          <w:lang w:val="fr-CH"/>
+        </w:rPr>
+      </w:pPr>
+      <w:r>
+        <w:rPr>
+          <w:lang w:val="fr-CH"/>
+        </w:rPr>
+        <w:t>Il réitère votre nomination au sein de l’organe suivant</w:t>
+      </w:r>
+    </w:p>
+    <w:p>
+      <w:pPr>
+        <w:rPr>
+          <w:lang w:val="fr-CH"/>
+        </w:rPr>
+      </w:pPr>
+    </w:p>
+    <w:p>
+      <w:pPr>
+        <w:rPr>
+          <w:b/>
+          <w:bCs/>
+          <w:lang w:val="fr-CH"/>
+        </w:rPr>
+      </w:pPr>
+      <w:r>
+        <w:rPr>
+          <w:b/>
+          <w:bCs/>
+          <w:lang w:val="fr-CH"/>
+        </w:rPr>
+        <w:t>&lt;&lt;[member.committeeName]&gt;&gt;</w:t>
+      </w:r>
+    </w:p>
+    <w:p>
+      <w:pPr>
+        <w:rPr>
+          <w:lang w:val="fr-CH"/>
+        </w:rPr>
+      </w:pPr>
+    </w:p>
+    <w:p>
+      <w:pPr>
+        <w:rPr>
+          <w:lang w:val="fr-CH"/>
+        </w:rPr>
+      </w:pPr>
+      <w:r>
+        <w:rPr>
+          <w:lang w:val="fr-CH"/>
+        </w:rPr>
+        <w:t>Les fonctions au sein de cet organe seront déterminées selon les règles qui lui sont applicables.</w:t>
+      </w:r>
+    </w:p>
+    <w:p>
+      <w:pPr>
+        <w:rPr>
+          <w:lang w:val="fr-CH"/>
+        </w:rPr>
+      </w:pPr>
+    </w:p>
+    <w:p>
+      <w:pPr>
+        <w:rPr>
+          <w:lang w:val="fr-CH"/>
+        </w:rPr>
+      </w:pPr>
+      <w:r>
+        <w:rPr>
+          <w:lang w:val="fr-CH"/>
+        </w:rPr>
+        <w:t>Au nom du Conseil fédéral, je vous adresse mes remerciements sincères pour l’excellent travail que vous avez accompli et je vous souhaite plein succès et beaucoup de satisfaction dans la poursuite de vos fonctions.</w:t>
+      </w:r>
+      <w:r>
+        <w:rPr>
+          <w:highlight w:val="yellow"/>
+          <w:lang w:val="fr-CH"/>
+        </w:rPr>
+        <w:t>&lt;&lt;/if&gt;&gt;</w:t>
+      </w:r>
+    </w:p>
+    <w:p>
+      <w:pPr>
+        <w:rPr>
+          <w:lang w:val="fr-CH"/>
+        </w:rPr>
+      </w:pPr>
+      <w:r>
+        <w:rPr>
+          <w:highlight w:val="yellow"/>
+          <w:lang w:val="fr-CH"/>
+        </w:rPr>
         <w:t>&lt;&lt;if [member.formLetterType == 2]&gt;&gt;</w:t>
       </w:r>
     </w:p>
@@ -1862,6 +2243,7 @@
           <w:highlight w:val="yellow"/>
           <w:lang w:val="fr-CH"/>
         </w:rPr>
+        <w:lastRenderedPageBreak/>
         <w:t>&lt;&lt;if [formLetter.hasSignature]&gt;&gt;</w:t>
       </w:r>
       <w:r>
@@ -1921,9 +2303,13 @@
               </wp:inline>
             </w:drawing>
           </mc:Choice>
-          <mc:Fallback xmlns:w16cei="http://schemas.microsoft.com/office/word/2026/wordml/cei">
+          <mc:Fallback>
             <w:pict>
-              <v:shape w14:anchorId="125B9A60" id="_x0000_s1027" type="#_x0000_t202" style="width:156pt;height:47.25pt;visibility:visible;mso-wrap-style:square;mso-left-percent:-10001;mso-top-percent:-10001;mso-position-horizontal:absolute;mso-position-horizontal-relative:char;mso-position-vertical:absolute;mso-position-vertical-relative:line;mso-left-percent:-10001;mso-top-percent:-10001;v-text-anchor:top" o:gfxdata="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" stroked="f">
+              <v:shapetype w14:anchorId="125B9A60" id="_x0000_t202" coordsize="21600,21600" o:spt="202" path="m,l,21600r21600,l21600,xe">
+                <v:stroke joinstyle="miter"/>
+                <v:path gradientshapeok="t" o:connecttype="rect"/>
+              </v:shapetype>
+              <v:shape id="Textfeld 2" o:spid="_x0000_s1026" type="#_x0000_t202" style="width:156pt;height:47.25pt;visibility:visible;mso-wrap-style:square;mso-left-percent:-10001;mso-top-percent:-10001;mso-position-horizontal:absolute;mso-position-horizontal-relative:char;mso-position-vertical:absolute;mso-position-vertical-relative:line;mso-left-percent:-10001;mso-top-percent:-10001;v-text-anchor:top" o:gfxdata="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" stroked="f">
                 <v:textbox>
                   <w:txbxContent>
                     <w:p>
@@ -2099,9 +2485,9 @@
       </w:r>
     </w:p>
     <w:sectPr>
-      <w:headerReference w:type="default" r:id="rId9"/>
-      <w:footerReference w:type="default" r:id="rId10"/>
-      <w:footerReference w:type="first" r:id="rId11"/>
+      <w:headerReference w:type="default" r:id="rId10"/>
+      <w:footerReference w:type="default" r:id="rId11"/>
+      <w:footerReference w:type="first" r:id="rId12"/>
       <w:pgSz w:w="11906" w:h="16838"/>
       <w:pgMar w:top="340" w:right="1134" w:bottom="907" w:left="1701" w:header="680" w:footer="198" w:gutter="0"/>
       <w:cols w:space="708"/>
@@ -2183,6 +2569,34 @@
           </w:pPr>
           <w:r>
             <w:t>&lt;&lt;[formLetter.senderStreet]&gt;&gt;, CH-&lt;&lt;[formLetter.senderZip]&gt;&gt; &lt;&lt;[formLetter.senderCity]&gt;&gt;</w:t>
+          </w:r>
+        </w:p>
+        <w:p>
+          <w:pPr>
+            <w:pStyle w:val="Fuzeile"/>
+          </w:pPr>
+          <w:r>
+            <w:t>&lt;&lt;[formLetter.sender</w:t>
+          </w:r>
+          <w:r>
+            <w:t>Phone</w:t>
+          </w:r>
+          <w:r>
+            <w:t>]&gt;&gt;</w:t>
+          </w:r>
+        </w:p>
+        <w:p>
+          <w:pPr>
+            <w:pStyle w:val="Fuzeile"/>
+          </w:pPr>
+          <w:r>
+            <w:t>&lt;&lt;[formLetter.sender</w:t>
+          </w:r>
+          <w:r>
+            <w:t>Email</w:t>
+          </w:r>
+          <w:r>
+            <w:t>]&gt;&gt;</w:t>
           </w:r>
         </w:p>
         <w:p>
@@ -2784,7 +3198,7 @@
   <w:style w:type="paragraph" w:default="1" w:styleId="Standard">
     <w:name w:val="Normal"/>
     <w:qFormat/>
-    <w:rsid w:val="00A809A7"/>
+    <w:rsid w:val="00A53EA2"/>
     <w:pPr>
       <w:spacing w:after="0" w:line="240" w:lineRule="auto"/>
     </w:pPr>
@@ -3038,7 +3452,6 @@
   <w:style w:type="character" w:default="1" w:styleId="Absatz-Standardschriftart">
     <w:name w:val="Default Paragraph Font"/>
     <w:uiPriority w:val="1"/>
-    <w:semiHidden/>
     <w:unhideWhenUsed/>
   </w:style>
   <w:style w:type="table" w:default="1" w:styleId="NormaleTabelle">

</xml_diff>

<commit_message>
feat(form-letters): update templates for committee dissolution withdrawal retirement election type #BKDO-4414
</commit_message>
<xml_diff>
--- a/src/Bk.APG.Api/Templates/FormLetterGeneralElection_French.docx
+++ b/src/Bk.APG.Api/Templates/FormLetterGeneralElection_French.docx
@@ -13,7 +13,23 @@
           <w:highlight w:val="green"/>
           <w:lang w:val="en-US"/>
         </w:rPr>
-        <w:t>&lt;&lt;foreach [member in formLetter.memberships]&gt;&gt;</w:t>
+        <w:t xml:space="preserve">&lt;&lt;foreach [member in </w:t>
+      </w:r>
+      <w:proofErr w:type="spellStart"/>
+      <w:r>
+        <w:rPr>
+          <w:highlight w:val="green"/>
+          <w:lang w:val="en-US"/>
+        </w:rPr>
+        <w:t>formLetter.memberships</w:t>
+      </w:r>
+      <w:proofErr w:type="spellEnd"/>
+      <w:r>
+        <w:rPr>
+          <w:highlight w:val="green"/>
+          <w:lang w:val="en-US"/>
+        </w:rPr>
+        <w:t>]&gt;&gt;</w:t>
       </w:r>
     </w:p>
     <w:tbl>
@@ -115,36 +131,64 @@
                 <w:szCs w:val="15"/>
                 <w:lang w:val="en-US"/>
               </w:rPr>
-              <w:t>&lt;&lt;</w:t>
-            </w:r>
+              <w:t>&lt;</w:t>
+            </w:r>
+            <w:proofErr w:type="gramStart"/>
             <w:r>
               <w:rPr>
                 <w:szCs w:val="15"/>
                 <w:lang w:val="en-US"/>
               </w:rPr>
+              <w:t>&lt;</w:t>
+            </w:r>
+            <w:r>
+              <w:rPr>
+                <w:szCs w:val="15"/>
+                <w:lang w:val="en-US"/>
+              </w:rPr>
               <w:t>[</w:t>
             </w:r>
+            <w:proofErr w:type="gramEnd"/>
             <w:r>
               <w:rPr>
                 <w:rFonts w:eastAsia="Times New Roman"/>
                 <w:szCs w:val="15"/>
                 <w:lang w:val="en-US"/>
               </w:rPr>
-              <w:t xml:space="preserve"> member</w:t>
-            </w:r>
-            <w:r>
-              <w:rPr>
+              <w:t xml:space="preserve"> </w:t>
+            </w:r>
+            <w:proofErr w:type="spellStart"/>
+            <w:proofErr w:type="gramStart"/>
+            <w:r>
+              <w:rPr>
+                <w:rFonts w:eastAsia="Times New Roman"/>
                 <w:szCs w:val="15"/>
                 <w:lang w:val="en-US"/>
               </w:rPr>
-              <w:t>.</w:t>
+              <w:t>member</w:t>
             </w:r>
             <w:r>
               <w:rPr>
                 <w:szCs w:val="15"/>
                 <w:lang w:val="en-US"/>
               </w:rPr>
-              <w:t>senderDepartment]&gt;&gt;</w:t>
+              <w:t>.</w:t>
+            </w:r>
+            <w:r>
+              <w:rPr>
+                <w:szCs w:val="15"/>
+                <w:lang w:val="en-US"/>
+              </w:rPr>
+              <w:t>senderDepartment</w:t>
+            </w:r>
+            <w:proofErr w:type="spellEnd"/>
+            <w:proofErr w:type="gramEnd"/>
+            <w:r>
+              <w:rPr>
+                <w:szCs w:val="15"/>
+                <w:lang w:val="en-US"/>
+              </w:rPr>
+              <w:t>]&gt;&gt;</w:t>
             </w:r>
             <w:bookmarkEnd w:id="0"/>
           </w:p>
@@ -165,6 +209,8 @@
               </w:rPr>
               <w:t>&lt;&lt;[</w:t>
             </w:r>
+            <w:proofErr w:type="spellStart"/>
+            <w:proofErr w:type="gramStart"/>
             <w:r>
               <w:rPr>
                 <w:rFonts w:eastAsia="Times New Roman"/>
@@ -191,7 +237,18 @@
                 <w:szCs w:val="15"/>
                 <w:lang w:val="en-US"/>
               </w:rPr>
-              <w:t>Office]&gt;&gt;</w:t>
+              <w:t>Office</w:t>
+            </w:r>
+            <w:proofErr w:type="spellEnd"/>
+            <w:proofErr w:type="gramEnd"/>
+            <w:r>
+              <w:rPr>
+                <w:b/>
+                <w:bCs/>
+                <w:szCs w:val="15"/>
+                <w:lang w:val="en-US"/>
+              </w:rPr>
+              <w:t>]&gt;&gt;</w:t>
             </w:r>
           </w:p>
         </w:tc>
@@ -199,7 +256,7 @@
     </w:tbl>
     <w:tbl>
       <w:tblPr>
-        <w:tblStyle w:val="Tabellenraster"/>
+        <w:tblStyle w:val="TableGrid"/>
         <w:tblW w:w="0" w:type="auto"/>
         <w:tblLayout w:type="fixed"/>
         <w:tblCellMar>
@@ -333,6 +390,8 @@
               </w:rPr>
               <w:t>&lt;&lt;[</w:t>
             </w:r>
+            <w:proofErr w:type="spellStart"/>
+            <w:proofErr w:type="gramStart"/>
             <w:r>
               <w:rPr>
                 <w:rFonts w:eastAsiaTheme="minorHAnsi" w:cs="Arial"/>
@@ -349,7 +408,18 @@
                 <w:szCs w:val="12"/>
                 <w:lang w:eastAsia="en-US"/>
               </w:rPr>
-              <w:t>.senderOfficeShort]&gt;&gt;</w:t>
+              <w:t>.senderOfficeShort</w:t>
+            </w:r>
+            <w:proofErr w:type="spellEnd"/>
+            <w:proofErr w:type="gramEnd"/>
+            <w:r>
+              <w:rPr>
+                <w:rFonts w:eastAsiaTheme="minorHAnsi" w:cs="Arial"/>
+                <w:sz w:val="12"/>
+                <w:szCs w:val="12"/>
+                <w:lang w:eastAsia="en-US"/>
+              </w:rPr>
+              <w:t>]&gt;&gt;</w:t>
             </w:r>
           </w:p>
         </w:tc>
@@ -395,6 +465,8 @@
               </w:rPr>
               <w:t>&lt;&lt;[</w:t>
             </w:r>
+            <w:proofErr w:type="spellStart"/>
+            <w:proofErr w:type="gramStart"/>
             <w:r>
               <w:rPr>
                 <w:rFonts w:cs="Arial"/>
@@ -419,6 +491,8 @@
               </w:rPr>
               <w:t>senderZip</w:t>
             </w:r>
+            <w:proofErr w:type="spellEnd"/>
+            <w:proofErr w:type="gramEnd"/>
             <w:r>
               <w:rPr>
                 <w:rFonts w:cs="Arial"/>
@@ -427,6 +501,8 @@
               </w:rPr>
               <w:t>]&gt;&gt; &lt;&lt;[</w:t>
             </w:r>
+            <w:proofErr w:type="spellStart"/>
+            <w:proofErr w:type="gramStart"/>
             <w:r>
               <w:rPr>
                 <w:rFonts w:cs="Arial"/>
@@ -451,6 +527,8 @@
               </w:rPr>
               <w:t>senderCity</w:t>
             </w:r>
+            <w:proofErr w:type="spellEnd"/>
+            <w:proofErr w:type="gramEnd"/>
             <w:r>
               <w:rPr>
                 <w:rFonts w:cs="Arial"/>
@@ -613,7 +691,23 @@
               <w:rPr>
                 <w:lang w:val="en-US"/>
               </w:rPr>
-              <w:t>&lt;&lt;[member.salutation]&gt;&gt;</w:t>
+              <w:t>&lt;&lt;[</w:t>
+            </w:r>
+            <w:proofErr w:type="spellStart"/>
+            <w:proofErr w:type="gramStart"/>
+            <w:r>
+              <w:rPr>
+                <w:lang w:val="en-US"/>
+              </w:rPr>
+              <w:t>member.salutation</w:t>
+            </w:r>
+            <w:proofErr w:type="spellEnd"/>
+            <w:proofErr w:type="gramEnd"/>
+            <w:r>
+              <w:rPr>
+                <w:lang w:val="en-US"/>
+              </w:rPr>
+              <w:t>]&gt;&gt;</w:t>
             </w:r>
           </w:p>
           <w:p>
@@ -626,7 +720,39 @@
               <w:rPr>
                 <w:lang w:val="en-US"/>
               </w:rPr>
-              <w:t>&lt;&lt;[member.givenName]&gt;&gt; &lt;&lt;[member.surname]&gt;&gt;</w:t>
+              <w:t>&lt;&lt;[</w:t>
+            </w:r>
+            <w:proofErr w:type="spellStart"/>
+            <w:proofErr w:type="gramStart"/>
+            <w:r>
+              <w:rPr>
+                <w:lang w:val="en-US"/>
+              </w:rPr>
+              <w:t>member.givenName</w:t>
+            </w:r>
+            <w:proofErr w:type="spellEnd"/>
+            <w:proofErr w:type="gramEnd"/>
+            <w:r>
+              <w:rPr>
+                <w:lang w:val="en-US"/>
+              </w:rPr>
+              <w:t>]&gt;&gt; &lt;&lt;[</w:t>
+            </w:r>
+            <w:proofErr w:type="spellStart"/>
+            <w:proofErr w:type="gramStart"/>
+            <w:r>
+              <w:rPr>
+                <w:lang w:val="en-US"/>
+              </w:rPr>
+              <w:t>member.surname</w:t>
+            </w:r>
+            <w:proofErr w:type="spellEnd"/>
+            <w:proofErr w:type="gramEnd"/>
+            <w:r>
+              <w:rPr>
+                <w:lang w:val="en-US"/>
+              </w:rPr>
+              <w:t>]&gt;&gt;</w:t>
             </w:r>
           </w:p>
           <w:p>
@@ -639,7 +765,23 @@
               <w:rPr>
                 <w:lang w:val="en-US"/>
               </w:rPr>
-              <w:t>&lt;&lt;[member.companyName]&gt;&gt;</w:t>
+              <w:t>&lt;&lt;[</w:t>
+            </w:r>
+            <w:proofErr w:type="spellStart"/>
+            <w:proofErr w:type="gramStart"/>
+            <w:r>
+              <w:rPr>
+                <w:lang w:val="en-US"/>
+              </w:rPr>
+              <w:t>member.companyName</w:t>
+            </w:r>
+            <w:proofErr w:type="spellEnd"/>
+            <w:proofErr w:type="gramEnd"/>
+            <w:r>
+              <w:rPr>
+                <w:lang w:val="en-US"/>
+              </w:rPr>
+              <w:t>]&gt;&gt;</w:t>
             </w:r>
           </w:p>
           <w:p>
@@ -652,7 +794,23 @@
               <w:rPr>
                 <w:lang w:val="en-US"/>
               </w:rPr>
-              <w:t>&lt;&lt;[member.street]&gt;&gt;</w:t>
+              <w:t>&lt;&lt;[</w:t>
+            </w:r>
+            <w:proofErr w:type="spellStart"/>
+            <w:proofErr w:type="gramStart"/>
+            <w:r>
+              <w:rPr>
+                <w:lang w:val="en-US"/>
+              </w:rPr>
+              <w:t>member.street</w:t>
+            </w:r>
+            <w:proofErr w:type="spellEnd"/>
+            <w:proofErr w:type="gramEnd"/>
+            <w:r>
+              <w:rPr>
+                <w:lang w:val="en-US"/>
+              </w:rPr>
+              <w:t>]&gt;&gt;</w:t>
             </w:r>
           </w:p>
           <w:p>
@@ -665,7 +823,23 @@
               <w:rPr>
                 <w:lang w:val="en-US"/>
               </w:rPr>
-              <w:t>&lt;&lt;[member.poBox]&gt;&gt;</w:t>
+              <w:t>&lt;&lt;[</w:t>
+            </w:r>
+            <w:proofErr w:type="spellStart"/>
+            <w:proofErr w:type="gramStart"/>
+            <w:r>
+              <w:rPr>
+                <w:lang w:val="en-US"/>
+              </w:rPr>
+              <w:t>member.poBox</w:t>
+            </w:r>
+            <w:proofErr w:type="spellEnd"/>
+            <w:proofErr w:type="gramEnd"/>
+            <w:r>
+              <w:rPr>
+                <w:lang w:val="en-US"/>
+              </w:rPr>
+              <w:t>]&gt;&gt;</w:t>
             </w:r>
           </w:p>
           <w:p>
@@ -692,6 +866,8 @@
               </w:rPr>
               <w:t>.zip]&gt;&gt; &lt;&lt;[</w:t>
             </w:r>
+            <w:proofErr w:type="spellStart"/>
+            <w:proofErr w:type="gramStart"/>
             <w:r>
               <w:rPr>
                 <w:lang w:val="en-US"/>
@@ -702,7 +878,15 @@
               <w:rPr>
                 <w:lang w:val="en-US"/>
               </w:rPr>
-              <w:t>.city]&gt;&gt;</w:t>
+              <w:t>.city</w:t>
+            </w:r>
+            <w:proofErr w:type="spellEnd"/>
+            <w:proofErr w:type="gramEnd"/>
+            <w:r>
+              <w:rPr>
+                <w:lang w:val="en-US"/>
+              </w:rPr>
+              <w:t>]&gt;&gt;</w:t>
             </w:r>
           </w:p>
           <w:p>
@@ -717,6 +901,8 @@
               </w:rPr>
               <w:t>&lt;&lt;[</w:t>
             </w:r>
+            <w:proofErr w:type="spellStart"/>
+            <w:proofErr w:type="gramStart"/>
             <w:r>
               <w:rPr>
                 <w:lang w:val="en-US"/>
@@ -727,7 +913,15 @@
               <w:rPr>
                 <w:lang w:val="en-US"/>
               </w:rPr>
-              <w:t>.country]&gt;&gt;</w:t>
+              <w:t>.country</w:t>
+            </w:r>
+            <w:proofErr w:type="spellEnd"/>
+            <w:proofErr w:type="gramEnd"/>
+            <w:r>
+              <w:rPr>
+                <w:lang w:val="en-US"/>
+              </w:rPr>
+              <w:t>]&gt;&gt;</w:t>
             </w:r>
           </w:p>
         </w:tc>
@@ -768,6 +962,8 @@
               </w:rPr>
               <w:t>&lt;&lt;[</w:t>
             </w:r>
+            <w:proofErr w:type="spellStart"/>
+            <w:proofErr w:type="gramStart"/>
             <w:r>
               <w:rPr>
                 <w:b/>
@@ -782,23 +978,45 @@
                 <w:bCs/>
                 <w:szCs w:val="15"/>
               </w:rPr>
-              <w:t>.senderCity]&gt;&gt;, &lt;&lt;[</w:t>
-            </w:r>
+              <w:t>.senderCity</w:t>
+            </w:r>
+            <w:proofErr w:type="spellEnd"/>
+            <w:proofErr w:type="gramEnd"/>
             <w:r>
               <w:rPr>
                 <w:b/>
                 <w:bCs/>
                 <w:szCs w:val="15"/>
               </w:rPr>
-              <w:t>member</w:t>
-            </w:r>
+              <w:t>]&gt;&gt;, &lt;&lt;[</w:t>
+            </w:r>
+            <w:proofErr w:type="spellStart"/>
+            <w:proofErr w:type="gramStart"/>
             <w:r>
               <w:rPr>
                 <w:b/>
                 <w:bCs/>
                 <w:szCs w:val="15"/>
               </w:rPr>
-              <w:t>.dateLetter]&gt;&gt;</w:t>
+              <w:t>member</w:t>
+            </w:r>
+            <w:r>
+              <w:rPr>
+                <w:b/>
+                <w:bCs/>
+                <w:szCs w:val="15"/>
+              </w:rPr>
+              <w:t>.dateLetter</w:t>
+            </w:r>
+            <w:proofErr w:type="spellEnd"/>
+            <w:proofErr w:type="gramEnd"/>
+            <w:r>
+              <w:rPr>
+                <w:b/>
+                <w:bCs/>
+                <w:szCs w:val="15"/>
+              </w:rPr>
+              <w:t>]&gt;&gt;</w:t>
             </w:r>
           </w:p>
         </w:tc>
@@ -820,6 +1038,8 @@
         </w:rPr>
         <w:t>&lt;&lt;[</w:t>
       </w:r>
+      <w:proofErr w:type="spellStart"/>
+      <w:proofErr w:type="gramStart"/>
       <w:r>
         <w:rPr>
           <w:b/>
@@ -844,6 +1064,8 @@
         </w:rPr>
         <w:t>subject</w:t>
       </w:r>
+      <w:proofErr w:type="spellEnd"/>
+      <w:proofErr w:type="gramEnd"/>
       <w:r>
         <w:rPr>
           <w:b/>
@@ -872,6 +1094,8 @@
         </w:rPr>
         <w:t>&lt;&lt;[</w:t>
       </w:r>
+      <w:proofErr w:type="spellStart"/>
+      <w:proofErr w:type="gramStart"/>
       <w:r>
         <w:rPr>
           <w:lang w:val="en-US"/>
@@ -890,6 +1114,8 @@
         </w:rPr>
         <w:t>Text</w:t>
       </w:r>
+      <w:proofErr w:type="spellEnd"/>
+      <w:proofErr w:type="gramEnd"/>
       <w:r>
         <w:rPr>
           <w:lang w:val="en-US"/>
@@ -905,6 +1131,68 @@
       </w:pPr>
     </w:p>
     <w:p>
+      <w:r>
+        <w:rPr>
+          <w:highlight w:val="yellow"/>
+        </w:rPr>
+        <w:t>&lt;&lt;</w:t>
+      </w:r>
+      <w:proofErr w:type="spellStart"/>
+      <w:r>
+        <w:rPr>
+          <w:highlight w:val="yellow"/>
+        </w:rPr>
+        <w:t>if</w:t>
+      </w:r>
+      <w:proofErr w:type="spellEnd"/>
+      <w:r>
+        <w:rPr>
+          <w:highlight w:val="yellow"/>
+        </w:rPr>
+        <w:t xml:space="preserve"> [</w:t>
+      </w:r>
+      <w:proofErr w:type="spellStart"/>
+      <w:proofErr w:type="gramStart"/>
+      <w:r>
+        <w:rPr>
+          <w:highlight w:val="yellow"/>
+        </w:rPr>
+        <w:t>member.formLetterType</w:t>
+      </w:r>
+      <w:proofErr w:type="spellEnd"/>
+      <w:r>
+        <w:rPr>
+          <w:highlight w:val="yellow"/>
+        </w:rPr>
+        <w:t xml:space="preserve"> </w:t>
+      </w:r>
+      <w:r>
+        <w:rPr>
+          <w:highlight w:val="yellow"/>
+        </w:rPr>
+        <w:t>!=</w:t>
+      </w:r>
+      <w:proofErr w:type="gramEnd"/>
+      <w:r>
+        <w:rPr>
+          <w:highlight w:val="yellow"/>
+        </w:rPr>
+        <w:t xml:space="preserve"> </w:t>
+      </w:r>
+      <w:r>
+        <w:rPr>
+          <w:highlight w:val="yellow"/>
+        </w:rPr>
+        <w:t>5</w:t>
+      </w:r>
+      <w:r>
+        <w:rPr>
+          <w:highlight w:val="yellow"/>
+        </w:rPr>
+        <w:t>]&gt;&gt;</w:t>
+      </w:r>
+    </w:p>
+    <w:p>
       <w:pPr>
         <w:rPr>
           <w:lang w:val="fr-CH"/>
@@ -920,7 +1208,51 @@
         <w:rPr>
           <w:lang w:val="fr-CH"/>
         </w:rPr>
-        <w:t xml:space="preserve"> &lt;&lt;[formLetter.nextTermOfOfficeBeginDate]:"dd.MM.yyyy"&gt;&gt; </w:t>
+        <w:t xml:space="preserve"> &lt;</w:t>
+      </w:r>
+      <w:proofErr w:type="gramStart"/>
+      <w:r>
+        <w:rPr>
+          <w:lang w:val="fr-CH"/>
+        </w:rPr>
+        <w:t>&lt;[</w:t>
+      </w:r>
+      <w:proofErr w:type="spellStart"/>
+      <w:proofErr w:type="gramEnd"/>
+      <w:r>
+        <w:rPr>
+          <w:lang w:val="fr-CH"/>
+        </w:rPr>
+        <w:t>formLetter.nextTermOfOfficeBeginDate</w:t>
+      </w:r>
+      <w:proofErr w:type="spellEnd"/>
+      <w:proofErr w:type="gramStart"/>
+      <w:r>
+        <w:rPr>
+          <w:lang w:val="fr-CH"/>
+        </w:rPr>
+        <w:t>]:</w:t>
+      </w:r>
+      <w:proofErr w:type="gramEnd"/>
+      <w:r>
+        <w:rPr>
+          <w:lang w:val="fr-CH"/>
+        </w:rPr>
+        <w:t>"</w:t>
+      </w:r>
+      <w:proofErr w:type="spellStart"/>
+      <w:r>
+        <w:rPr>
+          <w:lang w:val="fr-CH"/>
+        </w:rPr>
+        <w:t>dd.MM.yyyy</w:t>
+      </w:r>
+      <w:proofErr w:type="spellEnd"/>
+      <w:r>
+        <w:rPr>
+          <w:lang w:val="fr-CH"/>
+        </w:rPr>
+        <w:t xml:space="preserve">"&gt;&gt; </w:t>
       </w:r>
       <w:r>
         <w:rPr>
@@ -938,28 +1270,122 @@
         <w:rPr>
           <w:lang w:val="fr-CH"/>
         </w:rPr>
-        <w:t>&lt;&lt;[formLetter.nextTermOfOfficeEndDate]:"dd.MM.yyyy"&gt;&gt;.</w:t>
-      </w:r>
-    </w:p>
-    <w:p>
-      <w:pPr>
-        <w:rPr>
-          <w:lang w:val="fr-CH"/>
-        </w:rPr>
-      </w:pPr>
-    </w:p>
-    <w:p>
-      <w:pPr>
-        <w:rPr>
-          <w:lang w:val="en-US"/>
-        </w:rPr>
-      </w:pPr>
-      <w:r>
-        <w:rPr>
-          <w:highlight w:val="yellow"/>
-          <w:lang w:val="en-US"/>
-        </w:rPr>
-        <w:t>&lt;&lt;if [member.formLetterType == 0 &amp;&amp; member.selfOrganized == fa</w:t>
+        <w:t>&lt;</w:t>
+      </w:r>
+      <w:proofErr w:type="gramStart"/>
+      <w:r>
+        <w:rPr>
+          <w:lang w:val="fr-CH"/>
+        </w:rPr>
+        <w:t>&lt;[</w:t>
+      </w:r>
+      <w:proofErr w:type="spellStart"/>
+      <w:proofErr w:type="gramEnd"/>
+      <w:r>
+        <w:rPr>
+          <w:lang w:val="fr-CH"/>
+        </w:rPr>
+        <w:t>formLetter.nextTermOfOfficeEndDate</w:t>
+      </w:r>
+      <w:proofErr w:type="spellEnd"/>
+      <w:proofErr w:type="gramStart"/>
+      <w:r>
+        <w:rPr>
+          <w:lang w:val="fr-CH"/>
+        </w:rPr>
+        <w:t>]:</w:t>
+      </w:r>
+      <w:proofErr w:type="gramEnd"/>
+      <w:r>
+        <w:rPr>
+          <w:lang w:val="fr-CH"/>
+        </w:rPr>
+        <w:t>"</w:t>
+      </w:r>
+      <w:proofErr w:type="spellStart"/>
+      <w:r>
+        <w:rPr>
+          <w:lang w:val="fr-CH"/>
+        </w:rPr>
+        <w:t>dd.MM.yyyy</w:t>
+      </w:r>
+      <w:proofErr w:type="spellEnd"/>
+      <w:r>
+        <w:rPr>
+          <w:lang w:val="fr-CH"/>
+        </w:rPr>
+        <w:t>"&gt;&gt;.</w:t>
+      </w:r>
+    </w:p>
+    <w:p>
+      <w:pPr>
+        <w:rPr>
+          <w:lang w:val="fr-CH"/>
+        </w:rPr>
+      </w:pPr>
+    </w:p>
+    <w:p>
+      <w:pPr>
+        <w:rPr>
+          <w:lang w:val="en-US"/>
+        </w:rPr>
+      </w:pPr>
+      <w:r>
+        <w:rPr>
+          <w:highlight w:val="yellow"/>
+          <w:lang w:val="en-US"/>
+        </w:rPr>
+        <w:t>&lt;&lt;/if&gt;&gt;</w:t>
+      </w:r>
+    </w:p>
+    <w:p>
+      <w:pPr>
+        <w:rPr>
+          <w:lang w:val="en-US"/>
+        </w:rPr>
+      </w:pPr>
+      <w:r>
+        <w:rPr>
+          <w:highlight w:val="yellow"/>
+          <w:lang w:val="en-US"/>
+        </w:rPr>
+        <w:t>&lt;&lt;if [</w:t>
+      </w:r>
+      <w:proofErr w:type="spellStart"/>
+      <w:proofErr w:type="gramStart"/>
+      <w:r>
+        <w:rPr>
+          <w:highlight w:val="yellow"/>
+          <w:lang w:val="en-US"/>
+        </w:rPr>
+        <w:t>member.formLetterType</w:t>
+      </w:r>
+      <w:proofErr w:type="spellEnd"/>
+      <w:proofErr w:type="gramEnd"/>
+      <w:r>
+        <w:rPr>
+          <w:highlight w:val="yellow"/>
+          <w:lang w:val="en-US"/>
+        </w:rPr>
+        <w:t xml:space="preserve"> == 0 &amp;&amp; </w:t>
+      </w:r>
+      <w:proofErr w:type="spellStart"/>
+      <w:proofErr w:type="gramStart"/>
+      <w:r>
+        <w:rPr>
+          <w:highlight w:val="yellow"/>
+          <w:lang w:val="en-US"/>
+        </w:rPr>
+        <w:t>member.selfOrganized</w:t>
+      </w:r>
+      <w:proofErr w:type="spellEnd"/>
+      <w:proofErr w:type="gramEnd"/>
+      <w:r>
+        <w:rPr>
+          <w:highlight w:val="yellow"/>
+          <w:lang w:val="en-US"/>
+        </w:rPr>
+        <w:t xml:space="preserve"> == fa</w:t>
       </w:r>
       <w:r>
         <w:rPr>
@@ -1000,16 +1426,46 @@
           <w:bCs/>
           <w:lang w:val="fr-CH"/>
         </w:rPr>
-        <w:t>&lt;&lt;[member.function]</w:t>
-      </w:r>
-      <w:r>
-        <w:rPr>
-          <w:b/>
-          <w:bCs/>
-          <w:lang w:val="fr-CH"/>
-        </w:rPr>
-        <w:t>:lower</w:t>
-      </w:r>
+        <w:t>&lt;&lt;[</w:t>
+      </w:r>
+      <w:proofErr w:type="spellStart"/>
+      <w:proofErr w:type="gramStart"/>
+      <w:r>
+        <w:rPr>
+          <w:b/>
+          <w:bCs/>
+          <w:lang w:val="fr-CH"/>
+        </w:rPr>
+        <w:t>member.function</w:t>
+      </w:r>
+      <w:proofErr w:type="spellEnd"/>
+      <w:r>
+        <w:rPr>
+          <w:b/>
+          <w:bCs/>
+          <w:lang w:val="fr-CH"/>
+        </w:rPr>
+        <w:t>]</w:t>
+      </w:r>
+      <w:r>
+        <w:rPr>
+          <w:b/>
+          <w:bCs/>
+          <w:lang w:val="fr-CH"/>
+        </w:rPr>
+        <w:t>:</w:t>
+      </w:r>
+      <w:proofErr w:type="spellStart"/>
+      <w:r>
+        <w:rPr>
+          <w:b/>
+          <w:bCs/>
+          <w:lang w:val="fr-CH"/>
+        </w:rPr>
+        <w:t>lower</w:t>
+      </w:r>
+      <w:proofErr w:type="spellEnd"/>
+      <w:proofErr w:type="gramEnd"/>
       <w:r>
         <w:rPr>
           <w:b/>
@@ -1028,39 +1484,73 @@
         <w:rPr>
           <w:lang w:val="fr-CH"/>
         </w:rPr>
-        <w:t>au sein de l’organe suivant</w:t>
-      </w:r>
-      <w:r>
-        <w:rPr>
-          <w:lang w:val="fr-CH"/>
-        </w:rPr>
-        <w:t xml:space="preserve">: </w:t>
-      </w:r>
-    </w:p>
-    <w:p>
-      <w:pPr>
-        <w:rPr>
-          <w:b/>
-          <w:highlight w:val="yellow"/>
-          <w:lang w:val="fr-CH"/>
-        </w:rPr>
-      </w:pPr>
-    </w:p>
-    <w:p>
-      <w:pPr>
-        <w:rPr>
-          <w:b/>
-          <w:bCs/>
-          <w:lang w:val="fr-CH"/>
-        </w:rPr>
-      </w:pPr>
-      <w:r>
-        <w:rPr>
-          <w:b/>
-          <w:bCs/>
-          <w:lang w:val="fr-CH"/>
-        </w:rPr>
-        <w:t>&lt;&lt;[member.committeeName]&gt;&gt;</w:t>
+        <w:t xml:space="preserve">au sein de l’organe </w:t>
+      </w:r>
+      <w:proofErr w:type="gramStart"/>
+      <w:r>
+        <w:rPr>
+          <w:lang w:val="fr-CH"/>
+        </w:rPr>
+        <w:t>suivant</w:t>
+      </w:r>
+      <w:r>
+        <w:rPr>
+          <w:lang w:val="fr-CH"/>
+        </w:rPr>
+        <w:t>:</w:t>
+      </w:r>
+      <w:proofErr w:type="gramEnd"/>
+      <w:r>
+        <w:rPr>
+          <w:lang w:val="fr-CH"/>
+        </w:rPr>
+        <w:t xml:space="preserve"> </w:t>
+      </w:r>
+    </w:p>
+    <w:p>
+      <w:pPr>
+        <w:rPr>
+          <w:b/>
+          <w:highlight w:val="yellow"/>
+          <w:lang w:val="fr-CH"/>
+        </w:rPr>
+      </w:pPr>
+    </w:p>
+    <w:p>
+      <w:pPr>
+        <w:rPr>
+          <w:b/>
+          <w:bCs/>
+          <w:lang w:val="fr-CH"/>
+        </w:rPr>
+      </w:pPr>
+      <w:r>
+        <w:rPr>
+          <w:b/>
+          <w:bCs/>
+          <w:lang w:val="fr-CH"/>
+        </w:rPr>
+        <w:t>&lt;&lt;[</w:t>
+      </w:r>
+      <w:proofErr w:type="spellStart"/>
+      <w:proofErr w:type="gramStart"/>
+      <w:r>
+        <w:rPr>
+          <w:b/>
+          <w:bCs/>
+          <w:lang w:val="fr-CH"/>
+        </w:rPr>
+        <w:t>member.committeeName</w:t>
+      </w:r>
+      <w:proofErr w:type="spellEnd"/>
+      <w:proofErr w:type="gramEnd"/>
+      <w:r>
+        <w:rPr>
+          <w:b/>
+          <w:bCs/>
+          <w:lang w:val="fr-CH"/>
+        </w:rPr>
+        <w:t>]&gt;&gt;</w:t>
       </w:r>
     </w:p>
     <w:p>
@@ -1127,7 +1617,23 @@
           <w:bCs/>
           <w:lang w:val="fr-CH"/>
         </w:rPr>
-        <w:t xml:space="preserve"> de l’ordonnance sur l’organisation du gouvernement et de l’administration; RS 172.010.1).</w:t>
+        <w:t xml:space="preserve"> de l’ordonnance sur l’organisation du gouvernement et de </w:t>
+      </w:r>
+      <w:proofErr w:type="gramStart"/>
+      <w:r>
+        <w:rPr>
+          <w:bCs/>
+          <w:lang w:val="fr-CH"/>
+        </w:rPr>
+        <w:t>l’administration;</w:t>
+      </w:r>
+      <w:proofErr w:type="gramEnd"/>
+      <w:r>
+        <w:rPr>
+          <w:bCs/>
+          <w:lang w:val="fr-CH"/>
+        </w:rPr>
+        <w:t xml:space="preserve"> RS 172.010.1).</w:t>
       </w:r>
     </w:p>
     <w:p>
@@ -1182,7 +1688,43 @@
           <w:highlight w:val="yellow"/>
           <w:lang w:val="en-US"/>
         </w:rPr>
-        <w:t xml:space="preserve">&lt;&lt;if [member.formLetterType == 0 &amp;&amp; member.selfOrganized == </w:t>
+        <w:t>&lt;&lt;if [</w:t>
+      </w:r>
+      <w:proofErr w:type="spellStart"/>
+      <w:proofErr w:type="gramStart"/>
+      <w:r>
+        <w:rPr>
+          <w:highlight w:val="yellow"/>
+          <w:lang w:val="en-US"/>
+        </w:rPr>
+        <w:t>member.formLetterType</w:t>
+      </w:r>
+      <w:proofErr w:type="spellEnd"/>
+      <w:proofErr w:type="gramEnd"/>
+      <w:r>
+        <w:rPr>
+          <w:highlight w:val="yellow"/>
+          <w:lang w:val="en-US"/>
+        </w:rPr>
+        <w:t xml:space="preserve"> == 0 &amp;&amp; </w:t>
+      </w:r>
+      <w:proofErr w:type="spellStart"/>
+      <w:proofErr w:type="gramStart"/>
+      <w:r>
+        <w:rPr>
+          <w:highlight w:val="yellow"/>
+          <w:lang w:val="en-US"/>
+        </w:rPr>
+        <w:t>member.selfOrganized</w:t>
+      </w:r>
+      <w:proofErr w:type="spellEnd"/>
+      <w:proofErr w:type="gramEnd"/>
+      <w:r>
+        <w:rPr>
+          <w:highlight w:val="yellow"/>
+          <w:lang w:val="en-US"/>
+        </w:rPr>
+        <w:t xml:space="preserve"> == </w:t>
       </w:r>
       <w:r>
         <w:rPr>
@@ -1209,31 +1751,59 @@
         <w:rPr>
           <w:lang w:val="fr-CH"/>
         </w:rPr>
-        <w:t>Il vous annonce votre nomination au sein de l’organe suivant:</w:t>
-      </w:r>
-    </w:p>
-    <w:p>
-      <w:pPr>
-        <w:rPr>
-          <w:lang w:val="fr-CH"/>
-        </w:rPr>
-      </w:pPr>
-    </w:p>
-    <w:p>
-      <w:pPr>
-        <w:rPr>
-          <w:b/>
-          <w:bCs/>
-          <w:lang w:val="fr-CH"/>
-        </w:rPr>
-      </w:pPr>
-      <w:r>
-        <w:rPr>
-          <w:b/>
-          <w:bCs/>
-          <w:lang w:val="fr-CH"/>
-        </w:rPr>
-        <w:t>&lt;&lt;[member.committeeName]&gt;&gt;</w:t>
+        <w:t xml:space="preserve">Il vous annonce votre nomination au sein de l’organe </w:t>
+      </w:r>
+      <w:proofErr w:type="gramStart"/>
+      <w:r>
+        <w:rPr>
+          <w:lang w:val="fr-CH"/>
+        </w:rPr>
+        <w:t>suivant:</w:t>
+      </w:r>
+      <w:proofErr w:type="gramEnd"/>
+    </w:p>
+    <w:p>
+      <w:pPr>
+        <w:rPr>
+          <w:lang w:val="fr-CH"/>
+        </w:rPr>
+      </w:pPr>
+    </w:p>
+    <w:p>
+      <w:pPr>
+        <w:rPr>
+          <w:b/>
+          <w:bCs/>
+          <w:lang w:val="fr-CH"/>
+        </w:rPr>
+      </w:pPr>
+      <w:r>
+        <w:rPr>
+          <w:b/>
+          <w:bCs/>
+          <w:lang w:val="fr-CH"/>
+        </w:rPr>
+        <w:t>&lt;&lt;[</w:t>
+      </w:r>
+      <w:proofErr w:type="spellStart"/>
+      <w:proofErr w:type="gramStart"/>
+      <w:r>
+        <w:rPr>
+          <w:b/>
+          <w:bCs/>
+          <w:lang w:val="fr-CH"/>
+        </w:rPr>
+        <w:t>member.committeeName</w:t>
+      </w:r>
+      <w:proofErr w:type="spellEnd"/>
+      <w:proofErr w:type="gramEnd"/>
+      <w:r>
+        <w:rPr>
+          <w:b/>
+          <w:bCs/>
+          <w:lang w:val="fr-CH"/>
+        </w:rPr>
+        <w:t>]&gt;&gt;</w:t>
       </w:r>
     </w:p>
     <w:p>
@@ -1332,7 +1902,23 @@
           <w:bCs/>
           <w:lang w:val="fr-CH"/>
         </w:rPr>
-        <w:t xml:space="preserve"> de l’ordonnance sur l’organisation du gouvernement et de l’administration; RS 172.010.1).</w:t>
+        <w:t xml:space="preserve"> de l’ordonnance sur l’organisation du gouvernement et de </w:t>
+      </w:r>
+      <w:proofErr w:type="gramStart"/>
+      <w:r>
+        <w:rPr>
+          <w:bCs/>
+          <w:lang w:val="fr-CH"/>
+        </w:rPr>
+        <w:t>l’administration;</w:t>
+      </w:r>
+      <w:proofErr w:type="gramEnd"/>
+      <w:r>
+        <w:rPr>
+          <w:bCs/>
+          <w:lang w:val="fr-CH"/>
+        </w:rPr>
+        <w:t xml:space="preserve"> RS 172.010.1).</w:t>
       </w:r>
     </w:p>
     <w:p>
@@ -1381,7 +1967,25 @@
           <w:highlight w:val="yellow"/>
           <w:lang w:val="en-US"/>
         </w:rPr>
-        <w:t>&lt;&lt;if [member.formLetterType == 1</w:t>
+        <w:t>&lt;&lt;if [</w:t>
+      </w:r>
+      <w:proofErr w:type="spellStart"/>
+      <w:proofErr w:type="gramStart"/>
+      <w:r>
+        <w:rPr>
+          <w:highlight w:val="yellow"/>
+          <w:lang w:val="en-US"/>
+        </w:rPr>
+        <w:t>member.formLetterType</w:t>
+      </w:r>
+      <w:proofErr w:type="spellEnd"/>
+      <w:proofErr w:type="gramEnd"/>
+      <w:r>
+        <w:rPr>
+          <w:highlight w:val="yellow"/>
+          <w:lang w:val="en-US"/>
+        </w:rPr>
+        <w:t xml:space="preserve"> == 1</w:t>
       </w:r>
       <w:r>
         <w:rPr>
@@ -1395,7 +1999,25 @@
           <w:highlight w:val="yellow"/>
           <w:lang w:val="en-US"/>
         </w:rPr>
-        <w:t xml:space="preserve">&amp;&amp; member.selfOrganized == </w:t>
+        <w:t xml:space="preserve">&amp;&amp; </w:t>
+      </w:r>
+      <w:proofErr w:type="spellStart"/>
+      <w:proofErr w:type="gramStart"/>
+      <w:r>
+        <w:rPr>
+          <w:highlight w:val="yellow"/>
+          <w:lang w:val="en-US"/>
+        </w:rPr>
+        <w:t>member.selfOrganized</w:t>
+      </w:r>
+      <w:proofErr w:type="spellEnd"/>
+      <w:proofErr w:type="gramEnd"/>
+      <w:r>
+        <w:rPr>
+          <w:highlight w:val="yellow"/>
+          <w:lang w:val="en-US"/>
+        </w:rPr>
+        <w:t xml:space="preserve"> == </w:t>
       </w:r>
       <w:r>
         <w:rPr>
@@ -1443,16 +2065,46 @@
           <w:bCs/>
           <w:lang w:val="fr-CH"/>
         </w:rPr>
-        <w:t>&lt;&lt;[member.function]</w:t>
-      </w:r>
-      <w:r>
-        <w:rPr>
-          <w:b/>
-          <w:bCs/>
-          <w:lang w:val="fr-CH"/>
-        </w:rPr>
-        <w:t>:lower</w:t>
-      </w:r>
+        <w:t>&lt;&lt;[</w:t>
+      </w:r>
+      <w:proofErr w:type="spellStart"/>
+      <w:proofErr w:type="gramStart"/>
+      <w:r>
+        <w:rPr>
+          <w:b/>
+          <w:bCs/>
+          <w:lang w:val="fr-CH"/>
+        </w:rPr>
+        <w:t>member.function</w:t>
+      </w:r>
+      <w:proofErr w:type="spellEnd"/>
+      <w:r>
+        <w:rPr>
+          <w:b/>
+          <w:bCs/>
+          <w:lang w:val="fr-CH"/>
+        </w:rPr>
+        <w:t>]</w:t>
+      </w:r>
+      <w:r>
+        <w:rPr>
+          <w:b/>
+          <w:bCs/>
+          <w:lang w:val="fr-CH"/>
+        </w:rPr>
+        <w:t>:</w:t>
+      </w:r>
+      <w:proofErr w:type="spellStart"/>
+      <w:r>
+        <w:rPr>
+          <w:b/>
+          <w:bCs/>
+          <w:lang w:val="fr-CH"/>
+        </w:rPr>
+        <w:t>lower</w:t>
+      </w:r>
+      <w:proofErr w:type="spellEnd"/>
+      <w:proofErr w:type="gramEnd"/>
       <w:r>
         <w:rPr>
           <w:b/>
@@ -1497,28 +2149,464 @@
           <w:bCs/>
           <w:lang w:val="fr-CH"/>
         </w:rPr>
-        <w:t>&lt;&lt;[member.committeeName]&gt;&gt;</w:t>
-      </w:r>
-    </w:p>
-    <w:p>
-      <w:pPr>
-        <w:rPr>
-          <w:lang w:val="fr-CH"/>
-        </w:rPr>
-      </w:pPr>
-    </w:p>
-    <w:p>
-      <w:pPr>
-        <w:rPr>
-          <w:lang w:val="fr-CH"/>
-        </w:rPr>
-      </w:pPr>
-      <w:r>
-        <w:rPr>
-          <w:lang w:val="fr-CH"/>
-        </w:rPr>
-        <w:t>Au nom du Conseil fédéral, je vous adresse mes remerciements sincères pour l’excellent travail que vous avez accompli et je vous souhaite plein succès et beaucoup de satisfaction dans la poursuite de vos fonctions.</w:t>
-      </w:r>
+        <w:t>&lt;&lt;[</w:t>
+      </w:r>
+      <w:proofErr w:type="spellStart"/>
+      <w:proofErr w:type="gramStart"/>
+      <w:r>
+        <w:rPr>
+          <w:b/>
+          <w:bCs/>
+          <w:lang w:val="fr-CH"/>
+        </w:rPr>
+        <w:t>member.committeeName</w:t>
+      </w:r>
+      <w:proofErr w:type="spellEnd"/>
+      <w:proofErr w:type="gramEnd"/>
+      <w:r>
+        <w:rPr>
+          <w:b/>
+          <w:bCs/>
+          <w:lang w:val="fr-CH"/>
+        </w:rPr>
+        <w:t>]&gt;&gt;</w:t>
+      </w:r>
+    </w:p>
+    <w:p>
+      <w:pPr>
+        <w:rPr>
+          <w:lang w:val="fr-CH"/>
+        </w:rPr>
+      </w:pPr>
+    </w:p>
+    <w:p>
+      <w:pPr>
+        <w:rPr>
+          <w:lang w:val="fr-CH"/>
+        </w:rPr>
+      </w:pPr>
+      <w:r>
+        <w:rPr>
+          <w:lang w:val="fr-CH"/>
+        </w:rPr>
+        <w:t xml:space="preserve">Au nom du Conseil fédéral, je vous adresse mes remerciements sincères pour l’excellent travail que vous avez accompli et je vous souhaite plein succès et beaucoup de satisfaction dans la poursuite de vos </w:t>
+      </w:r>
+      <w:proofErr w:type="gramStart"/>
+      <w:r>
+        <w:rPr>
+          <w:lang w:val="fr-CH"/>
+        </w:rPr>
+        <w:t>fonctions.</w:t>
+      </w:r>
+      <w:r>
+        <w:rPr>
+          <w:highlight w:val="yellow"/>
+          <w:lang w:val="fr-CH"/>
+        </w:rPr>
+        <w:t>&lt;</w:t>
+      </w:r>
+      <w:proofErr w:type="gramEnd"/>
+      <w:r>
+        <w:rPr>
+          <w:highlight w:val="yellow"/>
+          <w:lang w:val="fr-CH"/>
+        </w:rPr>
+        <w:t>&lt;/if&gt;&gt;</w:t>
+      </w:r>
+    </w:p>
+    <w:p>
+      <w:pPr>
+        <w:rPr>
+          <w:lang w:val="en-US"/>
+        </w:rPr>
+      </w:pPr>
+      <w:r>
+        <w:rPr>
+          <w:highlight w:val="yellow"/>
+          <w:lang w:val="en-US"/>
+        </w:rPr>
+        <w:t>&lt;&lt;if [</w:t>
+      </w:r>
+      <w:proofErr w:type="spellStart"/>
+      <w:proofErr w:type="gramStart"/>
+      <w:r>
+        <w:rPr>
+          <w:highlight w:val="yellow"/>
+          <w:lang w:val="en-US"/>
+        </w:rPr>
+        <w:t>member.formLetterType</w:t>
+      </w:r>
+      <w:proofErr w:type="spellEnd"/>
+      <w:proofErr w:type="gramEnd"/>
+      <w:r>
+        <w:rPr>
+          <w:highlight w:val="yellow"/>
+          <w:lang w:val="en-US"/>
+        </w:rPr>
+        <w:t xml:space="preserve"> == 1</w:t>
+      </w:r>
+      <w:r>
+        <w:rPr>
+          <w:highlight w:val="yellow"/>
+          <w:lang w:val="en-US"/>
+        </w:rPr>
+        <w:t xml:space="preserve"> </w:t>
+      </w:r>
+      <w:r>
+        <w:rPr>
+          <w:highlight w:val="yellow"/>
+          <w:lang w:val="en-US"/>
+        </w:rPr>
+        <w:t xml:space="preserve">&amp;&amp; </w:t>
+      </w:r>
+      <w:proofErr w:type="spellStart"/>
+      <w:proofErr w:type="gramStart"/>
+      <w:r>
+        <w:rPr>
+          <w:highlight w:val="yellow"/>
+          <w:lang w:val="en-US"/>
+        </w:rPr>
+        <w:t>member.selfOrganized</w:t>
+      </w:r>
+      <w:proofErr w:type="spellEnd"/>
+      <w:proofErr w:type="gramEnd"/>
+      <w:r>
+        <w:rPr>
+          <w:highlight w:val="yellow"/>
+          <w:lang w:val="en-US"/>
+        </w:rPr>
+        <w:t xml:space="preserve"> == </w:t>
+      </w:r>
+      <w:r>
+        <w:rPr>
+          <w:highlight w:val="yellow"/>
+          <w:lang w:val="en-US"/>
+        </w:rPr>
+        <w:t>true</w:t>
+      </w:r>
+      <w:r>
+        <w:rPr>
+          <w:highlight w:val="yellow"/>
+          <w:lang w:val="en-US"/>
+        </w:rPr>
+        <w:t>]</w:t>
+      </w:r>
+      <w:r>
+        <w:rPr>
+          <w:highlight w:val="yellow"/>
+          <w:lang w:val="en-US"/>
+        </w:rPr>
+        <w:t>&gt;&gt;</w:t>
+      </w:r>
+    </w:p>
+    <w:p>
+      <w:pPr>
+        <w:rPr>
+          <w:rFonts w:cs="Arial"/>
+          <w:lang w:val="fr-CH"/>
+        </w:rPr>
+      </w:pPr>
+      <w:r>
+        <w:rPr>
+          <w:lang w:val="fr-CH"/>
+        </w:rPr>
+        <w:t>Il réitère votre nomination au sein de l’organe suivant</w:t>
+      </w:r>
+    </w:p>
+    <w:p>
+      <w:pPr>
+        <w:rPr>
+          <w:lang w:val="fr-CH"/>
+        </w:rPr>
+      </w:pPr>
+    </w:p>
+    <w:p>
+      <w:pPr>
+        <w:rPr>
+          <w:b/>
+          <w:bCs/>
+          <w:lang w:val="fr-CH"/>
+        </w:rPr>
+      </w:pPr>
+      <w:r>
+        <w:rPr>
+          <w:b/>
+          <w:bCs/>
+          <w:lang w:val="fr-CH"/>
+        </w:rPr>
+        <w:t>&lt;&lt;[</w:t>
+      </w:r>
+      <w:proofErr w:type="spellStart"/>
+      <w:proofErr w:type="gramStart"/>
+      <w:r>
+        <w:rPr>
+          <w:b/>
+          <w:bCs/>
+          <w:lang w:val="fr-CH"/>
+        </w:rPr>
+        <w:t>member.committeeName</w:t>
+      </w:r>
+      <w:proofErr w:type="spellEnd"/>
+      <w:proofErr w:type="gramEnd"/>
+      <w:r>
+        <w:rPr>
+          <w:b/>
+          <w:bCs/>
+          <w:lang w:val="fr-CH"/>
+        </w:rPr>
+        <w:t>]&gt;&gt;</w:t>
+      </w:r>
+    </w:p>
+    <w:p>
+      <w:pPr>
+        <w:rPr>
+          <w:lang w:val="fr-CH"/>
+        </w:rPr>
+      </w:pPr>
+    </w:p>
+    <w:p>
+      <w:pPr>
+        <w:rPr>
+          <w:lang w:val="fr-CH"/>
+        </w:rPr>
+      </w:pPr>
+      <w:r>
+        <w:rPr>
+          <w:lang w:val="fr-CH"/>
+        </w:rPr>
+        <w:t>Les fonctions au sein de cet organe seront déterminées selon les règles qui lui sont applicables.</w:t>
+      </w:r>
+    </w:p>
+    <w:p>
+      <w:pPr>
+        <w:rPr>
+          <w:lang w:val="fr-CH"/>
+        </w:rPr>
+      </w:pPr>
+    </w:p>
+    <w:p>
+      <w:pPr>
+        <w:rPr>
+          <w:lang w:val="fr-CH"/>
+        </w:rPr>
+      </w:pPr>
+      <w:r>
+        <w:rPr>
+          <w:lang w:val="fr-CH"/>
+        </w:rPr>
+        <w:t xml:space="preserve">Au nom du Conseil fédéral, je vous adresse mes remerciements sincères pour l’excellent travail que vous avez accompli et je vous souhaite plein succès et beaucoup de satisfaction dans la poursuite de vos </w:t>
+      </w:r>
+      <w:proofErr w:type="gramStart"/>
+      <w:r>
+        <w:rPr>
+          <w:lang w:val="fr-CH"/>
+        </w:rPr>
+        <w:t>fonctions.</w:t>
+      </w:r>
+      <w:r>
+        <w:rPr>
+          <w:highlight w:val="yellow"/>
+          <w:lang w:val="fr-CH"/>
+        </w:rPr>
+        <w:t>&lt;</w:t>
+      </w:r>
+      <w:proofErr w:type="gramEnd"/>
+      <w:r>
+        <w:rPr>
+          <w:highlight w:val="yellow"/>
+          <w:lang w:val="fr-CH"/>
+        </w:rPr>
+        <w:t>&lt;/if&gt;&gt;</w:t>
+      </w:r>
+    </w:p>
+    <w:p>
+      <w:pPr>
+        <w:rPr>
+          <w:lang w:val="fr-CH"/>
+        </w:rPr>
+      </w:pPr>
+      <w:r>
+        <w:rPr>
+          <w:highlight w:val="yellow"/>
+          <w:lang w:val="fr-CH"/>
+        </w:rPr>
+        <w:t>&lt;&lt;if [</w:t>
+      </w:r>
+      <w:proofErr w:type="spellStart"/>
+      <w:proofErr w:type="gramStart"/>
+      <w:r>
+        <w:rPr>
+          <w:highlight w:val="yellow"/>
+          <w:lang w:val="fr-CH"/>
+        </w:rPr>
+        <w:t>member.formLetterType</w:t>
+      </w:r>
+      <w:proofErr w:type="spellEnd"/>
+      <w:proofErr w:type="gramEnd"/>
+      <w:r>
+        <w:rPr>
+          <w:highlight w:val="yellow"/>
+          <w:lang w:val="fr-CH"/>
+        </w:rPr>
+        <w:t xml:space="preserve"> == 2]&gt;&gt;</w:t>
+      </w:r>
+    </w:p>
+    <w:p>
+      <w:pPr>
+        <w:rPr>
+          <w:lang w:val="fr-CH"/>
+        </w:rPr>
+      </w:pPr>
+      <w:r>
+        <w:rPr>
+          <w:lang w:val="fr-CH"/>
+        </w:rPr>
+        <w:t>Il a pris acte de votre démission pour le</w:t>
+      </w:r>
+      <w:r>
+        <w:rPr>
+          <w:lang w:val="fr-CH"/>
+        </w:rPr>
+        <w:t xml:space="preserve"> &lt;</w:t>
+      </w:r>
+      <w:proofErr w:type="gramStart"/>
+      <w:r>
+        <w:rPr>
+          <w:lang w:val="fr-CH"/>
+        </w:rPr>
+        <w:t>&lt;[</w:t>
+      </w:r>
+      <w:proofErr w:type="spellStart"/>
+      <w:proofErr w:type="gramEnd"/>
+      <w:r>
+        <w:rPr>
+          <w:lang w:val="fr-CH"/>
+        </w:rPr>
+        <w:t>formLetter.termOfOfficeEndDate</w:t>
+      </w:r>
+      <w:proofErr w:type="spellEnd"/>
+      <w:proofErr w:type="gramStart"/>
+      <w:r>
+        <w:rPr>
+          <w:lang w:val="fr-CH"/>
+        </w:rPr>
+        <w:t>]:</w:t>
+      </w:r>
+      <w:proofErr w:type="gramEnd"/>
+      <w:r>
+        <w:rPr>
+          <w:lang w:val="fr-CH"/>
+        </w:rPr>
+        <w:t>"</w:t>
+      </w:r>
+      <w:proofErr w:type="spellStart"/>
+      <w:r>
+        <w:rPr>
+          <w:lang w:val="fr-CH"/>
+        </w:rPr>
+        <w:t>dd.MM.yyyy</w:t>
+      </w:r>
+      <w:proofErr w:type="spellEnd"/>
+      <w:r>
+        <w:rPr>
+          <w:lang w:val="fr-CH"/>
+        </w:rPr>
+        <w:t>"&gt;&gt;</w:t>
+      </w:r>
+      <w:r>
+        <w:rPr>
+          <w:lang w:val="fr-CH"/>
+        </w:rPr>
+        <w:t xml:space="preserve"> </w:t>
+      </w:r>
+      <w:r>
+        <w:rPr>
+          <w:lang w:val="fr-CH"/>
+        </w:rPr>
+        <w:t>de l’organe suivant dont vous êtes actuellement</w:t>
+      </w:r>
+      <w:r>
+        <w:rPr>
+          <w:b/>
+          <w:lang w:val="fr-CH"/>
+        </w:rPr>
+        <w:t xml:space="preserve"> </w:t>
+      </w:r>
+      <w:r>
+        <w:rPr>
+          <w:b/>
+          <w:bCs/>
+          <w:lang w:val="fr-CH"/>
+        </w:rPr>
+        <w:t>&lt;&lt;[</w:t>
+      </w:r>
+      <w:proofErr w:type="spellStart"/>
+      <w:proofErr w:type="gramStart"/>
+      <w:r>
+        <w:rPr>
+          <w:b/>
+          <w:bCs/>
+          <w:lang w:val="fr-CH"/>
+        </w:rPr>
+        <w:t>member.function</w:t>
+      </w:r>
+      <w:proofErr w:type="spellEnd"/>
+      <w:r>
+        <w:rPr>
+          <w:b/>
+          <w:bCs/>
+          <w:lang w:val="fr-CH"/>
+        </w:rPr>
+        <w:t>]</w:t>
+      </w:r>
+      <w:r>
+        <w:rPr>
+          <w:b/>
+          <w:bCs/>
+          <w:lang w:val="fr-CH"/>
+        </w:rPr>
+        <w:t>:</w:t>
+      </w:r>
+      <w:proofErr w:type="spellStart"/>
+      <w:r>
+        <w:rPr>
+          <w:b/>
+          <w:bCs/>
+          <w:lang w:val="fr-CH"/>
+        </w:rPr>
+        <w:t>lower</w:t>
+      </w:r>
+      <w:proofErr w:type="spellEnd"/>
+      <w:proofErr w:type="gramEnd"/>
+      <w:r>
+        <w:rPr>
+          <w:b/>
+          <w:bCs/>
+          <w:lang w:val="fr-CH"/>
+        </w:rPr>
+        <w:t>&gt;&gt;</w:t>
+      </w:r>
+      <w:r>
+        <w:rPr>
+          <w:b/>
+          <w:bCs/>
+          <w:lang w:val="fr-CH"/>
+        </w:rPr>
+        <w:t xml:space="preserve"> </w:t>
+      </w:r>
+      <w:r>
+        <w:rPr>
+          <w:lang w:val="fr-CH"/>
+        </w:rPr>
+        <w:t>:</w:t>
+      </w:r>
+    </w:p>
+    <w:p>
+      <w:pPr>
+        <w:rPr>
+          <w:lang w:val="fr-CH"/>
+        </w:rPr>
+      </w:pPr>
       <w:r>
         <w:rPr>
           <w:highlight w:val="yellow"/>
@@ -1530,642 +2618,1047 @@
     <w:p>
       <w:pPr>
         <w:rPr>
-          <w:lang w:val="en-US"/>
-        </w:rPr>
-      </w:pPr>
-      <w:r>
-        <w:rPr>
-          <w:highlight w:val="yellow"/>
-          <w:lang w:val="en-US"/>
-        </w:rPr>
-        <w:t>&lt;&lt;if [member.formLetterType == 1</w:t>
-      </w:r>
-      <w:r>
-        <w:rPr>
-          <w:highlight w:val="yellow"/>
-          <w:lang w:val="en-US"/>
+          <w:lang w:val="fr-CH"/>
+        </w:rPr>
+      </w:pPr>
+      <w:r>
+        <w:rPr>
+          <w:highlight w:val="yellow"/>
+          <w:lang w:val="fr-CH"/>
+        </w:rPr>
+        <w:t>&lt;&lt;if [</w:t>
+      </w:r>
+      <w:proofErr w:type="spellStart"/>
+      <w:proofErr w:type="gramStart"/>
+      <w:r>
+        <w:rPr>
+          <w:highlight w:val="yellow"/>
+          <w:lang w:val="fr-CH"/>
+        </w:rPr>
+        <w:t>member.formLetterType</w:t>
+      </w:r>
+      <w:proofErr w:type="spellEnd"/>
+      <w:proofErr w:type="gramEnd"/>
+      <w:r>
+        <w:rPr>
+          <w:highlight w:val="yellow"/>
+          <w:lang w:val="fr-CH"/>
+        </w:rPr>
+        <w:t xml:space="preserve"> == 3]&gt;&gt;</w:t>
+      </w:r>
+    </w:p>
+    <w:p>
+      <w:pPr>
+        <w:rPr>
+          <w:lang w:val="fr-CH"/>
+        </w:rPr>
+      </w:pPr>
+      <w:r>
+        <w:rPr>
+          <w:lang w:val="fr-CH"/>
+        </w:rPr>
+        <w:t xml:space="preserve">Il a pris acte qu’ayant atteint la durée maximale de votre mandat, vous quitterez au </w:t>
+      </w:r>
+      <w:r>
+        <w:rPr>
+          <w:lang w:val="fr-CH"/>
+        </w:rPr>
+        <w:t>&lt;</w:t>
+      </w:r>
+      <w:proofErr w:type="gramStart"/>
+      <w:r>
+        <w:rPr>
+          <w:lang w:val="fr-CH"/>
+        </w:rPr>
+        <w:t>&lt;[</w:t>
+      </w:r>
+      <w:proofErr w:type="spellStart"/>
+      <w:proofErr w:type="gramEnd"/>
+      <w:r>
+        <w:rPr>
+          <w:lang w:val="fr-CH"/>
+        </w:rPr>
+        <w:t>formLetter.termOfOfficeEndDate</w:t>
+      </w:r>
+      <w:proofErr w:type="spellEnd"/>
+      <w:proofErr w:type="gramStart"/>
+      <w:r>
+        <w:rPr>
+          <w:lang w:val="fr-CH"/>
+        </w:rPr>
+        <w:t>]:</w:t>
+      </w:r>
+      <w:proofErr w:type="gramEnd"/>
+      <w:r>
+        <w:rPr>
+          <w:lang w:val="fr-CH"/>
+        </w:rPr>
+        <w:t>"</w:t>
+      </w:r>
+      <w:proofErr w:type="spellStart"/>
+      <w:r>
+        <w:rPr>
+          <w:lang w:val="fr-CH"/>
+        </w:rPr>
+        <w:t>dd.MM.yyyy</w:t>
+      </w:r>
+      <w:proofErr w:type="spellEnd"/>
+      <w:r>
+        <w:rPr>
+          <w:lang w:val="fr-CH"/>
+        </w:rPr>
+        <w:t>"&gt;&gt;</w:t>
+      </w:r>
+      <w:r>
+        <w:rPr>
+          <w:lang w:val="fr-CH"/>
         </w:rPr>
         <w:t xml:space="preserve"> </w:t>
       </w:r>
       <w:r>
         <w:rPr>
-          <w:highlight w:val="yellow"/>
-          <w:lang w:val="en-US"/>
-        </w:rPr>
-        <w:t xml:space="preserve">&amp;&amp; member.selfOrganized == </w:t>
-      </w:r>
-      <w:r>
-        <w:rPr>
-          <w:highlight w:val="yellow"/>
-          <w:lang w:val="en-US"/>
-        </w:rPr>
-        <w:t>true</w:t>
-      </w:r>
-      <w:r>
-        <w:rPr>
-          <w:highlight w:val="yellow"/>
-          <w:lang w:val="en-US"/>
+          <w:lang w:val="fr-CH"/>
+        </w:rPr>
+        <w:t>l’organe suivant dont vous êtes actuellement</w:t>
+      </w:r>
+      <w:r>
+        <w:rPr>
+          <w:lang w:val="fr-CH"/>
+        </w:rPr>
+        <w:t xml:space="preserve"> </w:t>
+      </w:r>
+      <w:r>
+        <w:rPr>
+          <w:b/>
+          <w:bCs/>
+          <w:lang w:val="fr-CH"/>
+        </w:rPr>
+        <w:t>&lt;&lt;[</w:t>
+      </w:r>
+      <w:proofErr w:type="spellStart"/>
+      <w:proofErr w:type="gramStart"/>
+      <w:r>
+        <w:rPr>
+          <w:b/>
+          <w:bCs/>
+          <w:lang w:val="fr-CH"/>
+        </w:rPr>
+        <w:t>member.function</w:t>
+      </w:r>
+      <w:proofErr w:type="spellEnd"/>
+      <w:r>
+        <w:rPr>
+          <w:b/>
+          <w:bCs/>
+          <w:lang w:val="fr-CH"/>
         </w:rPr>
         <w:t>]</w:t>
       </w:r>
       <w:r>
         <w:rPr>
-          <w:highlight w:val="yellow"/>
-          <w:lang w:val="en-US"/>
+          <w:b/>
+          <w:bCs/>
+          <w:lang w:val="fr-CH"/>
+        </w:rPr>
+        <w:t>:</w:t>
+      </w:r>
+      <w:proofErr w:type="spellStart"/>
+      <w:r>
+        <w:rPr>
+          <w:b/>
+          <w:bCs/>
+          <w:lang w:val="fr-CH"/>
+        </w:rPr>
+        <w:t>lower</w:t>
+      </w:r>
+      <w:proofErr w:type="spellEnd"/>
+      <w:proofErr w:type="gramEnd"/>
+      <w:r>
+        <w:rPr>
+          <w:b/>
+          <w:bCs/>
+          <w:lang w:val="fr-CH"/>
         </w:rPr>
         <w:t>&gt;&gt;</w:t>
       </w:r>
-    </w:p>
-    <w:p>
-      <w:pPr>
+      <w:r>
+        <w:rPr>
+          <w:lang w:val="fr-CH"/>
+        </w:rPr>
+        <w:t xml:space="preserve"> </w:t>
+      </w:r>
+      <w:r>
+        <w:rPr>
+          <w:lang w:val="fr-CH"/>
+        </w:rPr>
+        <w:t>:</w:t>
+      </w:r>
+      <w:r>
+        <w:rPr>
+          <w:highlight w:val="yellow"/>
+          <w:lang w:val="fr-CH"/>
+        </w:rPr>
+        <w:t>&lt;&lt;/if&gt;&gt;</w:t>
+      </w:r>
+    </w:p>
+    <w:p>
+      <w:pPr>
+        <w:rPr>
+          <w:lang w:val="fr-CH"/>
+        </w:rPr>
+      </w:pPr>
+      <w:r>
+        <w:rPr>
+          <w:highlight w:val="yellow"/>
+          <w:lang w:val="fr-CH"/>
+        </w:rPr>
+        <w:t>&lt;&lt;if [</w:t>
+      </w:r>
+      <w:proofErr w:type="spellStart"/>
+      <w:proofErr w:type="gramStart"/>
+      <w:r>
+        <w:rPr>
+          <w:highlight w:val="yellow"/>
+          <w:lang w:val="fr-CH"/>
+        </w:rPr>
+        <w:t>member.formLetterType</w:t>
+      </w:r>
+      <w:proofErr w:type="spellEnd"/>
+      <w:proofErr w:type="gramEnd"/>
+      <w:r>
+        <w:rPr>
+          <w:highlight w:val="yellow"/>
+          <w:lang w:val="fr-CH"/>
+        </w:rPr>
+        <w:t xml:space="preserve"> == 4]&gt;&gt;</w:t>
+      </w:r>
+    </w:p>
+    <w:p>
+      <w:pPr>
+        <w:rPr>
+          <w:lang w:val="fr-CH"/>
+        </w:rPr>
+      </w:pPr>
+      <w:r>
+        <w:rPr>
+          <w:lang w:val="fr-CH"/>
+        </w:rPr>
+        <w:t>Il a pris acte que vous quitterez au</w:t>
+      </w:r>
+      <w:r>
+        <w:rPr>
+          <w:lang w:val="fr-CH"/>
+        </w:rPr>
+        <w:t xml:space="preserve"> </w:t>
+      </w:r>
+      <w:r>
+        <w:rPr>
+          <w:lang w:val="fr-CH"/>
+        </w:rPr>
+        <w:t>&lt;</w:t>
+      </w:r>
+      <w:proofErr w:type="gramStart"/>
+      <w:r>
+        <w:rPr>
+          <w:lang w:val="fr-CH"/>
+        </w:rPr>
+        <w:t>&lt;[</w:t>
+      </w:r>
+      <w:proofErr w:type="spellStart"/>
+      <w:proofErr w:type="gramEnd"/>
+      <w:r>
+        <w:rPr>
+          <w:lang w:val="fr-CH"/>
+        </w:rPr>
+        <w:t>formLetter.termOfOfficeEndDate</w:t>
+      </w:r>
+      <w:proofErr w:type="spellEnd"/>
+      <w:proofErr w:type="gramStart"/>
+      <w:r>
+        <w:rPr>
+          <w:lang w:val="fr-CH"/>
+        </w:rPr>
+        <w:t>]:</w:t>
+      </w:r>
+      <w:proofErr w:type="gramEnd"/>
+      <w:r>
+        <w:rPr>
+          <w:lang w:val="fr-CH"/>
+        </w:rPr>
+        <w:t>"</w:t>
+      </w:r>
+      <w:proofErr w:type="spellStart"/>
+      <w:r>
+        <w:rPr>
+          <w:lang w:val="fr-CH"/>
+        </w:rPr>
+        <w:t>dd.MM.yyyy</w:t>
+      </w:r>
+      <w:proofErr w:type="spellEnd"/>
+      <w:r>
+        <w:rPr>
+          <w:lang w:val="fr-CH"/>
+        </w:rPr>
+        <w:t>"&gt;&gt;</w:t>
+      </w:r>
+      <w:r>
+        <w:rPr>
+          <w:lang w:val="fr-CH"/>
+        </w:rPr>
+        <w:t xml:space="preserve"> </w:t>
+      </w:r>
+      <w:r>
+        <w:rPr>
+          <w:lang w:val="fr-CH"/>
+        </w:rPr>
+        <w:t>l’organe suivant dont vous êtes actuellement</w:t>
+      </w:r>
+      <w:r>
+        <w:rPr>
+          <w:lang w:val="fr-CH"/>
+        </w:rPr>
+        <w:t xml:space="preserve"> </w:t>
+      </w:r>
+      <w:r>
+        <w:rPr>
+          <w:b/>
+          <w:bCs/>
+          <w:lang w:val="fr-CH"/>
+        </w:rPr>
+        <w:t>&lt;&lt;[</w:t>
+      </w:r>
+      <w:proofErr w:type="spellStart"/>
+      <w:proofErr w:type="gramStart"/>
+      <w:r>
+        <w:rPr>
+          <w:b/>
+          <w:bCs/>
+          <w:lang w:val="fr-CH"/>
+        </w:rPr>
+        <w:t>member.function</w:t>
+      </w:r>
+      <w:proofErr w:type="spellEnd"/>
+      <w:r>
+        <w:rPr>
+          <w:b/>
+          <w:bCs/>
+          <w:lang w:val="fr-CH"/>
+        </w:rPr>
+        <w:t>]</w:t>
+      </w:r>
+      <w:r>
+        <w:rPr>
+          <w:b/>
+          <w:bCs/>
+          <w:lang w:val="fr-CH"/>
+        </w:rPr>
+        <w:t>:</w:t>
+      </w:r>
+      <w:proofErr w:type="spellStart"/>
+      <w:r>
+        <w:rPr>
+          <w:b/>
+          <w:bCs/>
+          <w:lang w:val="fr-CH"/>
+        </w:rPr>
+        <w:t>lower</w:t>
+      </w:r>
+      <w:proofErr w:type="spellEnd"/>
+      <w:proofErr w:type="gramEnd"/>
+      <w:r>
+        <w:rPr>
+          <w:b/>
+          <w:bCs/>
+          <w:lang w:val="fr-CH"/>
+        </w:rPr>
+        <w:t>&gt;&gt;</w:t>
+      </w:r>
+      <w:r>
+        <w:rPr>
+          <w:b/>
+          <w:bCs/>
+          <w:lang w:val="fr-CH"/>
+        </w:rPr>
+        <w:t xml:space="preserve"> </w:t>
+      </w:r>
+      <w:r>
+        <w:rPr>
+          <w:lang w:val="fr-CH"/>
+        </w:rPr>
+        <w:t>:</w:t>
+      </w:r>
+      <w:r>
+        <w:rPr>
+          <w:highlight w:val="yellow"/>
+          <w:lang w:val="fr-CH"/>
+        </w:rPr>
+        <w:t>&lt;&lt;/if&gt;&gt;</w:t>
+      </w:r>
+    </w:p>
+    <w:p>
+      <w:pPr>
+        <w:rPr>
+          <w:lang w:val="fr-CH"/>
+        </w:rPr>
+      </w:pPr>
+      <w:r>
+        <w:rPr>
+          <w:highlight w:val="yellow"/>
+          <w:lang w:val="fr-CH"/>
+        </w:rPr>
+        <w:t>&lt;&lt;if [</w:t>
+      </w:r>
+      <w:proofErr w:type="spellStart"/>
+      <w:proofErr w:type="gramStart"/>
+      <w:r>
+        <w:rPr>
+          <w:highlight w:val="yellow"/>
+          <w:lang w:val="fr-CH"/>
+        </w:rPr>
+        <w:t>member.formLetterType</w:t>
+      </w:r>
+      <w:proofErr w:type="spellEnd"/>
+      <w:proofErr w:type="gramEnd"/>
+      <w:r>
+        <w:rPr>
+          <w:highlight w:val="yellow"/>
+          <w:lang w:val="fr-CH"/>
+        </w:rPr>
+        <w:t xml:space="preserve"> == 5]&gt;&gt;</w:t>
+      </w:r>
+      <w:r>
+        <w:rPr>
+          <w:noProof/>
+          <w:lang w:val="fr-CH"/>
+        </w:rPr>
+        <w:t xml:space="preserve"> </w:t>
+      </w:r>
+    </w:p>
+    <w:p>
+      <w:pPr>
+        <w:rPr>
+          <w:lang w:val="fr-CH"/>
+        </w:rPr>
+      </w:pPr>
+      <w:r>
+        <w:rPr>
+          <w:lang w:val="fr-CH"/>
+        </w:rPr>
+        <w:t>Le Conseil fédéral a décidé de dissoudre l’organe suivant avec effet au &lt;&lt;[</w:t>
+      </w:r>
+      <w:proofErr w:type="spellStart"/>
+      <w:proofErr w:type="gramStart"/>
+      <w:r>
+        <w:rPr>
+          <w:lang w:val="fr-CH"/>
+        </w:rPr>
+        <w:t>member.endDate</w:t>
+      </w:r>
+      <w:proofErr w:type="spellEnd"/>
+      <w:r>
+        <w:rPr>
+          <w:lang w:val="fr-CH"/>
+        </w:rPr>
+        <w:t>]:</w:t>
+      </w:r>
+      <w:proofErr w:type="gramEnd"/>
+      <w:r>
+        <w:rPr>
+          <w:lang w:val="fr-CH"/>
+        </w:rPr>
+        <w:t>"</w:t>
+      </w:r>
+      <w:proofErr w:type="spellStart"/>
+      <w:r>
+        <w:rPr>
+          <w:lang w:val="fr-CH"/>
+        </w:rPr>
+        <w:t>dd.MM.yyyy</w:t>
+      </w:r>
+      <w:proofErr w:type="spellEnd"/>
+      <w:r>
+        <w:rPr>
+          <w:lang w:val="fr-CH"/>
+        </w:rPr>
+        <w:t>"&gt;</w:t>
+      </w:r>
+      <w:proofErr w:type="gramStart"/>
+      <w:r>
+        <w:rPr>
+          <w:lang w:val="fr-CH"/>
+        </w:rPr>
+        <w:t>&gt;</w:t>
+      </w:r>
+      <w:r>
+        <w:rPr>
+          <w:lang w:val="fr-CH"/>
+        </w:rPr>
+        <w:t>:</w:t>
+      </w:r>
+      <w:proofErr w:type="gramEnd"/>
+    </w:p>
+    <w:p>
+      <w:pPr>
+        <w:rPr>
+          <w:lang w:val="fr-CH"/>
+        </w:rPr>
+      </w:pPr>
+    </w:p>
+    <w:p>
+      <w:pPr>
+        <w:rPr>
+          <w:b/>
+          <w:bCs/>
+          <w:lang w:val="fr-CH"/>
+        </w:rPr>
+      </w:pPr>
+      <w:r>
+        <w:rPr>
+          <w:b/>
+          <w:bCs/>
+          <w:lang w:val="fr-CH"/>
+        </w:rPr>
+        <w:t>&lt;&lt;[</w:t>
+      </w:r>
+      <w:proofErr w:type="spellStart"/>
+      <w:proofErr w:type="gramStart"/>
+      <w:r>
+        <w:rPr>
+          <w:b/>
+          <w:bCs/>
+          <w:lang w:val="fr-CH"/>
+        </w:rPr>
+        <w:t>member.committeeName</w:t>
+      </w:r>
+      <w:proofErr w:type="spellEnd"/>
+      <w:proofErr w:type="gramEnd"/>
+      <w:r>
+        <w:rPr>
+          <w:b/>
+          <w:bCs/>
+          <w:lang w:val="fr-CH"/>
+        </w:rPr>
+        <w:t>]&gt;&gt;</w:t>
+      </w:r>
+    </w:p>
+    <w:p>
+      <w:pPr>
+        <w:rPr>
+          <w:b/>
+          <w:bCs/>
+          <w:lang w:val="fr-CH"/>
+        </w:rPr>
+      </w:pPr>
+    </w:p>
+    <w:p>
+      <w:pPr>
+        <w:rPr>
+          <w:lang w:val="fr-CH"/>
+        </w:rPr>
+      </w:pPr>
+      <w:r>
+        <w:rPr>
+          <w:lang w:val="fr-CH"/>
+        </w:rPr>
+        <w:t xml:space="preserve">En conséquence, il prend acte de la fin de votre mandat en tant que </w:t>
+      </w:r>
+      <w:r>
+        <w:rPr>
+          <w:b/>
+          <w:bCs/>
+          <w:lang w:val="fr-CH"/>
+        </w:rPr>
+        <w:t>&lt;&lt;[</w:t>
+      </w:r>
+      <w:proofErr w:type="spellStart"/>
+      <w:proofErr w:type="gramStart"/>
+      <w:r>
+        <w:rPr>
+          <w:b/>
+          <w:bCs/>
+          <w:lang w:val="fr-CH"/>
+        </w:rPr>
+        <w:t>member.function</w:t>
+      </w:r>
+      <w:proofErr w:type="spellEnd"/>
+      <w:proofErr w:type="gramEnd"/>
+      <w:r>
+        <w:rPr>
+          <w:b/>
+          <w:bCs/>
+          <w:lang w:val="fr-CH"/>
+        </w:rPr>
+        <w:t>]&gt;&gt;</w:t>
+      </w:r>
+      <w:r>
+        <w:rPr>
+          <w:b/>
+          <w:lang w:val="fr-CH"/>
+        </w:rPr>
+        <w:t xml:space="preserve"> </w:t>
+      </w:r>
+      <w:r>
+        <w:rPr>
+          <w:lang w:val="fr-CH"/>
+        </w:rPr>
+        <w:t>avec effet au &lt;&lt;[</w:t>
+      </w:r>
+      <w:proofErr w:type="spellStart"/>
+      <w:proofErr w:type="gramStart"/>
+      <w:r>
+        <w:rPr>
+          <w:lang w:val="fr-CH"/>
+        </w:rPr>
+        <w:t>member.endDate</w:t>
+      </w:r>
+      <w:proofErr w:type="spellEnd"/>
+      <w:r>
+        <w:rPr>
+          <w:lang w:val="fr-CH"/>
+        </w:rPr>
+        <w:t>]:</w:t>
+      </w:r>
+      <w:proofErr w:type="gramEnd"/>
+      <w:r>
+        <w:rPr>
+          <w:lang w:val="fr-CH"/>
+        </w:rPr>
+        <w:t>"</w:t>
+      </w:r>
+      <w:proofErr w:type="spellStart"/>
+      <w:r>
+        <w:rPr>
+          <w:lang w:val="fr-CH"/>
+        </w:rPr>
+        <w:t>dd.MM.yyyy</w:t>
+      </w:r>
+      <w:proofErr w:type="spellEnd"/>
+      <w:r>
+        <w:rPr>
+          <w:lang w:val="fr-CH"/>
+        </w:rPr>
+        <w:t>"&gt;&gt;</w:t>
+      </w:r>
+      <w:r>
+        <w:rPr>
+          <w:lang w:val="fr-CH"/>
+        </w:rPr>
+        <w:t>.</w:t>
+      </w:r>
+    </w:p>
+    <w:p>
+      <w:pPr>
+        <w:rPr>
+          <w:b/>
+          <w:lang w:val="fr-CH"/>
+        </w:rPr>
+      </w:pPr>
+    </w:p>
+    <w:p>
+      <w:pPr>
+        <w:rPr>
+          <w:bCs/>
+          <w:lang w:val="fr-CH"/>
+        </w:rPr>
+      </w:pPr>
+      <w:r>
+        <w:rPr>
+          <w:bCs/>
+          <w:lang w:val="fr-CH"/>
+        </w:rPr>
+        <w:t>Au nom du Conseil fédéral, je vous adresse mes remerciements sincères pour l’excellent travail que vous avez accompli et je forme les vœux les meilleurs pour votre avenir.</w:t>
+      </w:r>
+    </w:p>
+    <w:p>
+      <w:pPr>
+        <w:rPr>
+          <w:lang w:val="en-US"/>
+        </w:rPr>
+      </w:pPr>
+      <w:r>
+        <w:rPr>
+          <w:highlight w:val="yellow"/>
+          <w:lang w:val="en-US"/>
+        </w:rPr>
+        <w:t>&lt;&lt;/if&gt;&gt;</w:t>
+      </w:r>
+    </w:p>
+    <w:p>
+      <w:pPr>
+        <w:rPr>
+          <w:lang w:val="en-US"/>
+        </w:rPr>
+      </w:pPr>
+      <w:r>
+        <w:rPr>
+          <w:highlight w:val="yellow"/>
+          <w:lang w:val="en-US"/>
+        </w:rPr>
+        <w:t>&lt;&lt;if [</w:t>
+      </w:r>
+      <w:proofErr w:type="spellStart"/>
+      <w:proofErr w:type="gramStart"/>
+      <w:r>
+        <w:rPr>
+          <w:highlight w:val="yellow"/>
+          <w:lang w:val="en-US"/>
+        </w:rPr>
+        <w:t>member.formLetterType</w:t>
+      </w:r>
+      <w:proofErr w:type="spellEnd"/>
+      <w:proofErr w:type="gramEnd"/>
+      <w:r>
+        <w:rPr>
+          <w:highlight w:val="yellow"/>
+          <w:lang w:val="en-US"/>
+        </w:rPr>
+        <w:t xml:space="preserve"> == </w:t>
+      </w:r>
+      <w:r>
+        <w:rPr>
+          <w:highlight w:val="yellow"/>
+          <w:lang w:val="en-US"/>
+        </w:rPr>
+        <w:t>2</w:t>
+      </w:r>
+      <w:r>
+        <w:rPr>
+          <w:highlight w:val="yellow"/>
+          <w:lang w:val="en-US"/>
+        </w:rPr>
+        <w:t xml:space="preserve"> || </w:t>
+      </w:r>
+      <w:proofErr w:type="spellStart"/>
+      <w:proofErr w:type="gramStart"/>
+      <w:r>
+        <w:rPr>
+          <w:highlight w:val="yellow"/>
+          <w:lang w:val="en-US"/>
+        </w:rPr>
+        <w:t>member.formLetterType</w:t>
+      </w:r>
+      <w:proofErr w:type="spellEnd"/>
+      <w:proofErr w:type="gramEnd"/>
+      <w:r>
+        <w:rPr>
+          <w:highlight w:val="yellow"/>
+          <w:lang w:val="en-US"/>
+        </w:rPr>
+        <w:t xml:space="preserve"> == </w:t>
+      </w:r>
+      <w:r>
+        <w:rPr>
+          <w:highlight w:val="yellow"/>
+          <w:lang w:val="en-US"/>
+        </w:rPr>
+        <w:t>3</w:t>
+      </w:r>
+      <w:r>
+        <w:rPr>
+          <w:highlight w:val="yellow"/>
+          <w:lang w:val="en-US"/>
+        </w:rPr>
+        <w:t xml:space="preserve"> </w:t>
+      </w:r>
+      <w:r>
+        <w:rPr>
+          <w:highlight w:val="yellow"/>
+          <w:lang w:val="en-US"/>
+        </w:rPr>
+        <w:t xml:space="preserve">|| </w:t>
+      </w:r>
+      <w:proofErr w:type="spellStart"/>
+      <w:proofErr w:type="gramStart"/>
+      <w:r>
+        <w:rPr>
+          <w:highlight w:val="yellow"/>
+          <w:lang w:val="en-US"/>
+        </w:rPr>
+        <w:t>member.formLetterType</w:t>
+      </w:r>
+      <w:proofErr w:type="spellEnd"/>
+      <w:proofErr w:type="gramEnd"/>
+      <w:r>
+        <w:rPr>
+          <w:highlight w:val="yellow"/>
+          <w:lang w:val="en-US"/>
+        </w:rPr>
+        <w:t xml:space="preserve"> == </w:t>
+      </w:r>
+      <w:r>
+        <w:rPr>
+          <w:highlight w:val="yellow"/>
+          <w:lang w:val="en-US"/>
+        </w:rPr>
+        <w:t>4</w:t>
+      </w:r>
+      <w:r>
+        <w:rPr>
+          <w:highlight w:val="yellow"/>
+          <w:lang w:val="en-US"/>
+        </w:rPr>
+        <w:t>]&gt;&gt;</w:t>
+      </w:r>
+    </w:p>
+    <w:p>
+      <w:pPr>
+        <w:rPr>
+          <w:b/>
+          <w:bCs/>
+          <w:lang w:val="en-US"/>
+        </w:rPr>
+      </w:pPr>
+    </w:p>
+    <w:p>
+      <w:pPr>
+        <w:rPr>
+          <w:b/>
+          <w:bCs/>
+          <w:lang w:val="fr-CH"/>
+        </w:rPr>
+      </w:pPr>
+      <w:r>
+        <w:rPr>
+          <w:b/>
+          <w:bCs/>
+          <w:lang w:val="fr-CH"/>
+        </w:rPr>
+        <w:t>&lt;&lt;[</w:t>
+      </w:r>
+      <w:proofErr w:type="spellStart"/>
+      <w:proofErr w:type="gramStart"/>
+      <w:r>
+        <w:rPr>
+          <w:b/>
+          <w:bCs/>
+          <w:lang w:val="fr-CH"/>
+        </w:rPr>
+        <w:t>member.committeeName</w:t>
+      </w:r>
+      <w:proofErr w:type="spellEnd"/>
+      <w:proofErr w:type="gramEnd"/>
+      <w:r>
+        <w:rPr>
+          <w:b/>
+          <w:bCs/>
+          <w:lang w:val="fr-CH"/>
+        </w:rPr>
+        <w:t>]&gt;&gt;</w:t>
+      </w:r>
+    </w:p>
+    <w:p>
+      <w:pPr>
+        <w:rPr>
+          <w:lang w:val="fr-CH"/>
+        </w:rPr>
+      </w:pPr>
+    </w:p>
+    <w:p>
+      <w:pPr>
+        <w:rPr>
+          <w:lang w:val="fr-CH"/>
+        </w:rPr>
+      </w:pPr>
+      <w:r>
+        <w:rPr>
+          <w:lang w:val="fr-CH"/>
+        </w:rPr>
+        <w:lastRenderedPageBreak/>
+        <w:t xml:space="preserve">Au nom du Conseil fédéral, je vous adresse mes remerciements sincères pour l’excellent travail que vous avez accompli et je forme les vœux les meilleurs pour votre </w:t>
+      </w:r>
+      <w:proofErr w:type="gramStart"/>
+      <w:r>
+        <w:rPr>
+          <w:lang w:val="fr-CH"/>
+        </w:rPr>
+        <w:t>avenir.</w:t>
+      </w:r>
+      <w:r>
+        <w:rPr>
+          <w:highlight w:val="yellow"/>
+          <w:lang w:val="fr-CH"/>
+        </w:rPr>
+        <w:t>&lt;</w:t>
+      </w:r>
+      <w:proofErr w:type="gramEnd"/>
+      <w:r>
+        <w:rPr>
+          <w:highlight w:val="yellow"/>
+          <w:lang w:val="fr-CH"/>
+        </w:rPr>
+        <w:t>&lt;/if&gt;&gt;</w:t>
+      </w:r>
+    </w:p>
+    <w:p>
+      <w:pPr>
+        <w:rPr>
+          <w:lang w:val="en-US"/>
+        </w:rPr>
+      </w:pPr>
+      <w:r>
+        <w:rPr>
+          <w:highlight w:val="yellow"/>
+          <w:lang w:val="en-US"/>
+        </w:rPr>
+        <w:t>&lt;&lt;if [</w:t>
+      </w:r>
+      <w:proofErr w:type="spellStart"/>
+      <w:proofErr w:type="gramStart"/>
+      <w:r>
+        <w:rPr>
+          <w:highlight w:val="yellow"/>
+          <w:lang w:val="en-US"/>
+        </w:rPr>
+        <w:t>member.formLetterType</w:t>
+      </w:r>
+      <w:proofErr w:type="spellEnd"/>
+      <w:proofErr w:type="gramEnd"/>
+      <w:r>
+        <w:rPr>
+          <w:highlight w:val="yellow"/>
+          <w:lang w:val="en-US"/>
+        </w:rPr>
+        <w:t xml:space="preserve"> == </w:t>
+      </w:r>
+      <w:r>
+        <w:rPr>
+          <w:highlight w:val="yellow"/>
+          <w:lang w:val="en-US"/>
+        </w:rPr>
+        <w:t>0</w:t>
+      </w:r>
+      <w:r>
+        <w:rPr>
+          <w:highlight w:val="yellow"/>
+          <w:lang w:val="en-US"/>
+        </w:rPr>
+        <w:t xml:space="preserve"> || </w:t>
+      </w:r>
+      <w:proofErr w:type="spellStart"/>
+      <w:proofErr w:type="gramStart"/>
+      <w:r>
+        <w:rPr>
+          <w:highlight w:val="yellow"/>
+          <w:lang w:val="en-US"/>
+        </w:rPr>
+        <w:t>member.formLetterType</w:t>
+      </w:r>
+      <w:proofErr w:type="spellEnd"/>
+      <w:proofErr w:type="gramEnd"/>
+      <w:r>
+        <w:rPr>
+          <w:highlight w:val="yellow"/>
+          <w:lang w:val="en-US"/>
+        </w:rPr>
+        <w:t xml:space="preserve"> == </w:t>
+      </w:r>
+      <w:r>
+        <w:rPr>
+          <w:highlight w:val="yellow"/>
+          <w:lang w:val="en-US"/>
+        </w:rPr>
+        <w:t>1</w:t>
+      </w:r>
+      <w:r>
+        <w:rPr>
+          <w:highlight w:val="yellow"/>
+          <w:lang w:val="en-US"/>
+        </w:rPr>
+        <w:t>]&gt;&gt;</w:t>
+      </w:r>
+    </w:p>
+    <w:p>
+      <w:pPr>
+        <w:rPr>
+          <w:lang w:val="en-US"/>
+        </w:rPr>
+      </w:pPr>
+    </w:p>
+    <w:p>
+      <w:pPr>
+        <w:rPr>
+          <w:lang w:val="fr-CH"/>
+        </w:rPr>
+      </w:pPr>
+      <w:r>
         <w:rPr>
           <w:rFonts w:cs="Arial"/>
           <w:lang w:val="fr-CH"/>
         </w:rPr>
-      </w:pPr>
-      <w:r>
-        <w:rPr>
-          <w:lang w:val="fr-CH"/>
-        </w:rPr>
-        <w:t>Il réitère votre nomination au sein de l’organe suivant</w:t>
-      </w:r>
-    </w:p>
-    <w:p>
-      <w:pPr>
-        <w:rPr>
-          <w:lang w:val="fr-CH"/>
-        </w:rPr>
-      </w:pPr>
-    </w:p>
-    <w:p>
-      <w:pPr>
-        <w:rPr>
-          <w:b/>
-          <w:bCs/>
-          <w:lang w:val="fr-CH"/>
-        </w:rPr>
-      </w:pPr>
-      <w:r>
-        <w:rPr>
-          <w:b/>
-          <w:bCs/>
-          <w:lang w:val="fr-CH"/>
-        </w:rPr>
-        <w:t>&lt;&lt;[member.committeeName]&gt;&gt;</w:t>
-      </w:r>
-    </w:p>
-    <w:p>
-      <w:pPr>
-        <w:rPr>
-          <w:lang w:val="fr-CH"/>
-        </w:rPr>
-      </w:pPr>
-    </w:p>
-    <w:p>
-      <w:pPr>
-        <w:rPr>
-          <w:lang w:val="fr-CH"/>
-        </w:rPr>
-      </w:pPr>
-      <w:r>
-        <w:rPr>
-          <w:lang w:val="fr-CH"/>
-        </w:rPr>
-        <w:t>Les fonctions au sein de cet organe seront déterminées selon les règles qui lui sont applicables.</w:t>
-      </w:r>
-    </w:p>
-    <w:p>
-      <w:pPr>
-        <w:rPr>
-          <w:lang w:val="fr-CH"/>
-        </w:rPr>
-      </w:pPr>
-    </w:p>
-    <w:p>
-      <w:pPr>
-        <w:rPr>
-          <w:lang w:val="fr-CH"/>
-        </w:rPr>
-      </w:pPr>
-      <w:r>
-        <w:rPr>
-          <w:lang w:val="fr-CH"/>
-        </w:rPr>
-        <w:t>Au nom du Conseil fédéral, je vous adresse mes remerciements sincères pour l’excellent travail que vous avez accompli et je vous souhaite plein succès et beaucoup de satisfaction dans la poursuite de vos fonctions.</w:t>
-      </w:r>
-      <w:r>
-        <w:rPr>
-          <w:highlight w:val="yellow"/>
-          <w:lang w:val="fr-CH"/>
-        </w:rPr>
-        <w:t>&lt;&lt;/if&gt;&gt;</w:t>
-      </w:r>
-    </w:p>
-    <w:p>
-      <w:pPr>
-        <w:rPr>
-          <w:lang w:val="fr-CH"/>
-        </w:rPr>
-      </w:pPr>
-      <w:r>
-        <w:rPr>
-          <w:highlight w:val="yellow"/>
-          <w:lang w:val="fr-CH"/>
-        </w:rPr>
-        <w:t>&lt;&lt;if [member.formLetterType == 2]&gt;&gt;</w:t>
-      </w:r>
-    </w:p>
-    <w:p>
-      <w:pPr>
-        <w:rPr>
-          <w:lang w:val="fr-CH"/>
-        </w:rPr>
-      </w:pPr>
-      <w:r>
-        <w:rPr>
-          <w:lang w:val="fr-CH"/>
-        </w:rPr>
-        <w:t>Il a pris acte de votre démission pour le</w:t>
-      </w:r>
-      <w:r>
-        <w:rPr>
-          <w:lang w:val="fr-CH"/>
-        </w:rPr>
-        <w:t xml:space="preserve"> &lt;&lt;[formLetter.termOfOfficeEndDate]:"dd.MM.yyyy"&gt;&gt;</w:t>
-      </w:r>
-      <w:r>
-        <w:rPr>
-          <w:lang w:val="fr-CH"/>
-        </w:rPr>
-        <w:t xml:space="preserve"> </w:t>
-      </w:r>
-      <w:r>
-        <w:rPr>
-          <w:lang w:val="fr-CH"/>
-        </w:rPr>
-        <w:t>de l’organe suivant dont vous êtes actuellement</w:t>
-      </w:r>
-      <w:r>
-        <w:rPr>
-          <w:b/>
-          <w:lang w:val="fr-CH"/>
-        </w:rPr>
-        <w:t xml:space="preserve"> </w:t>
-      </w:r>
-      <w:r>
-        <w:rPr>
-          <w:b/>
-          <w:bCs/>
-          <w:lang w:val="fr-CH"/>
-        </w:rPr>
-        <w:t>&lt;&lt;[member.function]</w:t>
-      </w:r>
-      <w:r>
-        <w:rPr>
-          <w:b/>
-          <w:bCs/>
-          <w:lang w:val="fr-CH"/>
-        </w:rPr>
-        <w:t>:lower</w:t>
-      </w:r>
-      <w:r>
-        <w:rPr>
-          <w:b/>
-          <w:bCs/>
-          <w:lang w:val="fr-CH"/>
-        </w:rPr>
-        <w:t>&gt;&gt;</w:t>
-      </w:r>
-      <w:r>
-        <w:rPr>
-          <w:b/>
-          <w:bCs/>
-          <w:lang w:val="fr-CH"/>
-        </w:rPr>
-        <w:t xml:space="preserve"> </w:t>
-      </w:r>
-      <w:r>
-        <w:rPr>
-          <w:lang w:val="fr-CH"/>
-        </w:rPr>
-        <w:t>:</w:t>
-      </w:r>
-    </w:p>
-    <w:p>
-      <w:pPr>
-        <w:rPr>
-          <w:lang w:val="fr-CH"/>
-        </w:rPr>
-      </w:pPr>
-      <w:r>
-        <w:rPr>
-          <w:highlight w:val="yellow"/>
-          <w:lang w:val="fr-CH"/>
-        </w:rPr>
-        <w:t>&lt;&lt;/if&gt;&gt;</w:t>
-      </w:r>
-    </w:p>
-    <w:p>
-      <w:pPr>
-        <w:rPr>
-          <w:lang w:val="fr-CH"/>
-        </w:rPr>
-      </w:pPr>
-      <w:r>
-        <w:rPr>
-          <w:highlight w:val="yellow"/>
-          <w:lang w:val="fr-CH"/>
-        </w:rPr>
-        <w:t>&lt;&lt;if [member.formLetterType == 3]&gt;&gt;</w:t>
-      </w:r>
-    </w:p>
-    <w:p>
-      <w:pPr>
-        <w:rPr>
-          <w:lang w:val="fr-CH"/>
-        </w:rPr>
-      </w:pPr>
-      <w:r>
-        <w:rPr>
-          <w:lang w:val="fr-CH"/>
-        </w:rPr>
-        <w:t xml:space="preserve">Il a pris acte qu’ayant atteint la durée maximale de votre mandat, vous quitterez au </w:t>
-      </w:r>
-      <w:r>
-        <w:rPr>
-          <w:lang w:val="fr-CH"/>
-        </w:rPr>
-        <w:t>&lt;&lt;[formLetter.termOfOfficeEndDate]:"dd.MM.yyyy"&gt;&gt;</w:t>
-      </w:r>
-      <w:r>
-        <w:rPr>
-          <w:lang w:val="fr-CH"/>
-        </w:rPr>
-        <w:t xml:space="preserve"> </w:t>
-      </w:r>
-      <w:r>
-        <w:rPr>
-          <w:lang w:val="fr-CH"/>
-        </w:rPr>
-        <w:t>l’organe suivant dont vous êtes actuellement</w:t>
-      </w:r>
-      <w:r>
-        <w:rPr>
-          <w:lang w:val="fr-CH"/>
-        </w:rPr>
-        <w:t xml:space="preserve"> </w:t>
-      </w:r>
-      <w:r>
-        <w:rPr>
-          <w:b/>
-          <w:bCs/>
-          <w:lang w:val="fr-CH"/>
-        </w:rPr>
-        <w:t>&lt;&lt;[member.function]</w:t>
-      </w:r>
-      <w:r>
-        <w:rPr>
-          <w:b/>
-          <w:bCs/>
-          <w:lang w:val="fr-CH"/>
-        </w:rPr>
-        <w:t>:lower</w:t>
-      </w:r>
-      <w:r>
-        <w:rPr>
-          <w:b/>
-          <w:bCs/>
-          <w:lang w:val="fr-CH"/>
-        </w:rPr>
-        <w:t>&gt;&gt;</w:t>
-      </w:r>
-      <w:r>
-        <w:rPr>
-          <w:lang w:val="fr-CH"/>
-        </w:rPr>
-        <w:t xml:space="preserve"> </w:t>
-      </w:r>
-      <w:r>
-        <w:rPr>
-          <w:lang w:val="fr-CH"/>
-        </w:rPr>
-        <w:t>:</w:t>
-      </w:r>
-      <w:r>
-        <w:rPr>
-          <w:highlight w:val="yellow"/>
-          <w:lang w:val="fr-CH"/>
-        </w:rPr>
-        <w:t>&lt;&lt;/if&gt;&gt;</w:t>
-      </w:r>
-    </w:p>
-    <w:p>
-      <w:pPr>
-        <w:rPr>
-          <w:lang w:val="fr-CH"/>
-        </w:rPr>
-      </w:pPr>
-      <w:r>
-        <w:rPr>
-          <w:highlight w:val="yellow"/>
-          <w:lang w:val="fr-CH"/>
-        </w:rPr>
-        <w:t>&lt;&lt;if [member.formLetterType == 4]&gt;&gt;</w:t>
-      </w:r>
-    </w:p>
-    <w:p>
-      <w:pPr>
-        <w:rPr>
-          <w:lang w:val="fr-CH"/>
-        </w:rPr>
-      </w:pPr>
-      <w:r>
-        <w:rPr>
-          <w:lang w:val="fr-CH"/>
-        </w:rPr>
-        <w:t>Il a pris acte que vous quitterez au</w:t>
-      </w:r>
-      <w:r>
-        <w:rPr>
-          <w:lang w:val="fr-CH"/>
-        </w:rPr>
-        <w:t xml:space="preserve"> </w:t>
-      </w:r>
-      <w:r>
-        <w:rPr>
-          <w:lang w:val="fr-CH"/>
-        </w:rPr>
-        <w:t>&lt;&lt;[formLetter.termOfOfficeEndDate]:"dd.MM.yyyy"&gt;&gt;</w:t>
-      </w:r>
-      <w:r>
-        <w:rPr>
-          <w:lang w:val="fr-CH"/>
-        </w:rPr>
-        <w:t xml:space="preserve"> </w:t>
-      </w:r>
-      <w:r>
-        <w:rPr>
-          <w:lang w:val="fr-CH"/>
-        </w:rPr>
-        <w:t>l’organe suivant dont vous êtes actuellement</w:t>
-      </w:r>
-      <w:r>
-        <w:rPr>
-          <w:lang w:val="fr-CH"/>
-        </w:rPr>
-        <w:t xml:space="preserve"> </w:t>
-      </w:r>
-      <w:r>
-        <w:rPr>
-          <w:b/>
-          <w:bCs/>
-          <w:lang w:val="fr-CH"/>
-        </w:rPr>
-        <w:t>&lt;&lt;[member.function]</w:t>
-      </w:r>
-      <w:r>
-        <w:rPr>
-          <w:b/>
-          <w:bCs/>
-          <w:lang w:val="fr-CH"/>
-        </w:rPr>
-        <w:t>:lower</w:t>
-      </w:r>
-      <w:r>
-        <w:rPr>
-          <w:b/>
-          <w:bCs/>
-          <w:lang w:val="fr-CH"/>
-        </w:rPr>
-        <w:t>&gt;&gt;</w:t>
-      </w:r>
-      <w:r>
-        <w:rPr>
-          <w:b/>
-          <w:bCs/>
-          <w:lang w:val="fr-CH"/>
-        </w:rPr>
-        <w:t xml:space="preserve"> </w:t>
-      </w:r>
-      <w:r>
-        <w:rPr>
-          <w:lang w:val="fr-CH"/>
-        </w:rPr>
-        <w:t>:</w:t>
-      </w:r>
-      <w:r>
-        <w:rPr>
-          <w:highlight w:val="yellow"/>
-          <w:lang w:val="fr-CH"/>
-        </w:rPr>
-        <w:t>&lt;&lt;/if&gt;&gt;</w:t>
-      </w:r>
-    </w:p>
-    <w:p>
-      <w:pPr>
-        <w:rPr>
-          <w:lang w:val="en-US"/>
-        </w:rPr>
-      </w:pPr>
-      <w:r>
-        <w:rPr>
-          <w:highlight w:val="yellow"/>
-          <w:lang w:val="en-US"/>
-        </w:rPr>
-        <w:t xml:space="preserve">&lt;&lt;if [member.formLetterType == </w:t>
-      </w:r>
-      <w:r>
-        <w:rPr>
-          <w:highlight w:val="yellow"/>
-          <w:lang w:val="en-US"/>
-        </w:rPr>
-        <w:t>2</w:t>
-      </w:r>
-      <w:r>
-        <w:rPr>
-          <w:highlight w:val="yellow"/>
-          <w:lang w:val="en-US"/>
-        </w:rPr>
-        <w:t xml:space="preserve"> || member.formLetterType == </w:t>
-      </w:r>
-      <w:r>
-        <w:rPr>
-          <w:highlight w:val="yellow"/>
-          <w:lang w:val="en-US"/>
-        </w:rPr>
-        <w:t>3</w:t>
-      </w:r>
-      <w:r>
-        <w:rPr>
-          <w:highlight w:val="yellow"/>
-          <w:lang w:val="en-US"/>
-        </w:rPr>
-        <w:t xml:space="preserve"> </w:t>
-      </w:r>
-      <w:r>
-        <w:rPr>
-          <w:highlight w:val="yellow"/>
-          <w:lang w:val="en-US"/>
-        </w:rPr>
-        <w:t xml:space="preserve">|| </w:t>
-      </w:r>
-      <w:r>
-        <w:rPr>
-          <w:highlight w:val="yellow"/>
-          <w:lang w:val="en-US"/>
-        </w:rPr>
-        <w:t xml:space="preserve">member.formLetterType == </w:t>
-      </w:r>
-      <w:r>
-        <w:rPr>
-          <w:highlight w:val="yellow"/>
-          <w:lang w:val="en-US"/>
-        </w:rPr>
-        <w:t>4</w:t>
-      </w:r>
-      <w:r>
-        <w:rPr>
-          <w:highlight w:val="yellow"/>
-          <w:lang w:val="en-US"/>
-        </w:rPr>
-        <w:t>]&gt;&gt;</w:t>
-      </w:r>
-    </w:p>
-    <w:p>
-      <w:pPr>
-        <w:rPr>
-          <w:b/>
-          <w:bCs/>
-          <w:lang w:val="en-US"/>
-        </w:rPr>
-      </w:pPr>
-    </w:p>
-    <w:p>
-      <w:pPr>
-        <w:rPr>
-          <w:b/>
-          <w:bCs/>
-          <w:lang w:val="fr-CH"/>
-        </w:rPr>
-      </w:pPr>
-      <w:r>
-        <w:rPr>
-          <w:b/>
-          <w:bCs/>
-          <w:lang w:val="fr-CH"/>
-        </w:rPr>
-        <w:t>&lt;&lt;[member.committeeName]&gt;&gt;</w:t>
-      </w:r>
-    </w:p>
-    <w:p>
-      <w:pPr>
-        <w:rPr>
-          <w:lang w:val="fr-CH"/>
-        </w:rPr>
-      </w:pPr>
-    </w:p>
-    <w:p>
-      <w:pPr>
-        <w:rPr>
-          <w:lang w:val="fr-CH"/>
-        </w:rPr>
-      </w:pPr>
-      <w:r>
-        <w:rPr>
-          <w:lang w:val="fr-CH"/>
-        </w:rPr>
-        <w:t>Au nom du Conseil fédéral, je vous adresse mes remerciements sincères pour l’excellent travail que vous avez accompli et je forme les vœux les meilleurs pour votre avenir.</w:t>
-      </w:r>
-      <w:r>
-        <w:rPr>
-          <w:highlight w:val="yellow"/>
-          <w:lang w:val="fr-CH"/>
-        </w:rPr>
-        <w:t>&lt;&lt;/if&gt;&gt;</w:t>
-      </w:r>
-    </w:p>
-    <w:p>
-      <w:pPr>
-        <w:rPr>
-          <w:lang w:val="en-US"/>
-        </w:rPr>
-      </w:pPr>
-      <w:r>
-        <w:rPr>
-          <w:highlight w:val="yellow"/>
-          <w:lang w:val="en-US"/>
-        </w:rPr>
-        <w:t xml:space="preserve">&lt;&lt;if [member.formLetterType == </w:t>
-      </w:r>
-      <w:r>
-        <w:rPr>
-          <w:highlight w:val="yellow"/>
-          <w:lang w:val="en-US"/>
-        </w:rPr>
-        <w:t>0</w:t>
-      </w:r>
-      <w:r>
-        <w:rPr>
-          <w:highlight w:val="yellow"/>
-          <w:lang w:val="en-US"/>
-        </w:rPr>
-        <w:t xml:space="preserve"> || member.formLetterType == </w:t>
-      </w:r>
-      <w:r>
-        <w:rPr>
-          <w:highlight w:val="yellow"/>
-          <w:lang w:val="en-US"/>
-        </w:rPr>
-        <w:t>1</w:t>
-      </w:r>
-      <w:r>
-        <w:rPr>
-          <w:highlight w:val="yellow"/>
-          <w:lang w:val="en-US"/>
-        </w:rPr>
-        <w:t>]&gt;&gt;</w:t>
-      </w:r>
-    </w:p>
-    <w:p>
-      <w:pPr>
-        <w:rPr>
-          <w:lang w:val="en-US"/>
-        </w:rPr>
-      </w:pPr>
-    </w:p>
-    <w:p>
-      <w:pPr>
-        <w:rPr>
-          <w:lang w:val="fr-CH"/>
-        </w:rPr>
-      </w:pPr>
+        <w:t xml:space="preserve">Je vous saurais gré de bien vouloir communiquer dans les meilleurs délais toute modification touchant votre adresse de correspondance ou vos liens d’intérêt qui interviendrait pendant la durée de votre mandat. </w:t>
+      </w:r>
+      <w:r>
+        <w:rPr>
+          <w:highlight w:val="yellow"/>
+          <w:lang w:val="fr-CH"/>
+        </w:rPr>
+        <w:t>&lt;&lt;/if&gt;&gt;&lt;&lt;if [</w:t>
+      </w:r>
+      <w:proofErr w:type="spellStart"/>
+      <w:proofErr w:type="gramStart"/>
+      <w:r>
+        <w:rPr>
+          <w:highlight w:val="yellow"/>
+          <w:lang w:val="fr-CH"/>
+        </w:rPr>
+        <w:t>member.formLetterType</w:t>
+      </w:r>
+      <w:proofErr w:type="spellEnd"/>
+      <w:proofErr w:type="gramEnd"/>
+      <w:r>
+        <w:rPr>
+          <w:highlight w:val="yellow"/>
+          <w:lang w:val="fr-CH"/>
+        </w:rPr>
+        <w:t xml:space="preserve"> == 0]&gt;&gt;</w:t>
+      </w:r>
       <w:r>
         <w:rPr>
           <w:rFonts w:cs="Arial"/>
           <w:lang w:val="fr-CH"/>
         </w:rPr>
-        <w:t xml:space="preserve">Je vous saurais gré de bien vouloir communiquer dans les meilleurs délais toute modification touchant votre adresse de correspondance ou vos liens d’intérêt qui interviendrait pendant la durée de votre mandat. </w:t>
-      </w:r>
-      <w:r>
-        <w:rPr>
-          <w:highlight w:val="yellow"/>
-          <w:lang w:val="fr-CH"/>
-        </w:rPr>
-        <w:t>&lt;&lt;/if&gt;&gt;&lt;&lt;if [member.formLetterType == 0]&gt;&gt;</w:t>
-      </w:r>
+        <w:t>Vous trouverez des informations sur le point de contact sur la page mentionnée ci-</w:t>
+      </w:r>
+      <w:proofErr w:type="gramStart"/>
       <w:r>
         <w:rPr>
           <w:rFonts w:cs="Arial"/>
           <w:lang w:val="fr-CH"/>
         </w:rPr>
-        <w:t>Vous trouverez des informations sur le point de contact sur la page mentionnée ci-dessus.</w:t>
-      </w:r>
-      <w:r>
-        <w:rPr>
-          <w:highlight w:val="yellow"/>
-          <w:lang w:val="fr-CH"/>
-        </w:rPr>
-        <w:t>&lt;&lt;/if&gt;&gt;&lt;&lt;if [member.formLetterType == 1]&gt;&gt;</w:t>
+        <w:t>dessus.</w:t>
+      </w:r>
+      <w:r>
+        <w:rPr>
+          <w:highlight w:val="yellow"/>
+          <w:lang w:val="fr-CH"/>
+        </w:rPr>
+        <w:t>&lt;</w:t>
+      </w:r>
+      <w:proofErr w:type="gramEnd"/>
+      <w:r>
+        <w:rPr>
+          <w:highlight w:val="yellow"/>
+          <w:lang w:val="fr-CH"/>
+        </w:rPr>
+        <w:t>&lt;/if&gt;&gt;&lt;&lt;if [</w:t>
+      </w:r>
+      <w:proofErr w:type="spellStart"/>
+      <w:proofErr w:type="gramStart"/>
+      <w:r>
+        <w:rPr>
+          <w:highlight w:val="yellow"/>
+          <w:lang w:val="fr-CH"/>
+        </w:rPr>
+        <w:t>member.formLetterType</w:t>
+      </w:r>
+      <w:proofErr w:type="spellEnd"/>
+      <w:proofErr w:type="gramEnd"/>
+      <w:r>
+        <w:rPr>
+          <w:highlight w:val="yellow"/>
+          <w:lang w:val="fr-CH"/>
+        </w:rPr>
+        <w:t xml:space="preserve"> == 1]&gt;&gt;</w:t>
       </w:r>
       <w:r>
         <w:rPr>
@@ -2187,7 +3680,16 @@
           <w:iCs/>
           <w:lang w:val="fr-CH"/>
         </w:rPr>
-        <w:t>www.admin.ch &gt; Administration fédérale &gt; Commissions extraparlementaires</w:t>
+        <w:t xml:space="preserve">www.admin.ch &gt; Administration fédérale &gt; Commissions </w:t>
+      </w:r>
+      <w:proofErr w:type="gramStart"/>
+      <w:r>
+        <w:rPr>
+          <w:i/>
+          <w:iCs/>
+          <w:lang w:val="fr-CH"/>
+        </w:rPr>
+        <w:t>extraparlementaires</w:t>
       </w:r>
       <w:r>
         <w:rPr>
@@ -2201,7 +3703,15 @@
           <w:highlight w:val="yellow"/>
           <w:lang w:val="fr-CH"/>
         </w:rPr>
-        <w:t>&lt;&lt;/if&gt;&gt;</w:t>
+        <w:t>&lt;</w:t>
+      </w:r>
+      <w:proofErr w:type="gramEnd"/>
+      <w:r>
+        <w:rPr>
+          <w:highlight w:val="yellow"/>
+          <w:lang w:val="fr-CH"/>
+        </w:rPr>
+        <w:t>&lt;/if&gt;&gt;</w:t>
       </w:r>
     </w:p>
     <w:p>
@@ -2243,8 +3753,23 @@
           <w:highlight w:val="yellow"/>
           <w:lang w:val="fr-CH"/>
         </w:rPr>
-        <w:lastRenderedPageBreak/>
-        <w:t>&lt;&lt;if [formLetter.hasSignature]&gt;&gt;</w:t>
+        <w:t>&lt;&lt;if [</w:t>
+      </w:r>
+      <w:proofErr w:type="spellStart"/>
+      <w:r>
+        <w:rPr>
+          <w:highlight w:val="yellow"/>
+          <w:lang w:val="fr-CH"/>
+        </w:rPr>
+        <w:t>formLetter.hasSignature</w:t>
+      </w:r>
+      <w:proofErr w:type="spellEnd"/>
+      <w:r>
+        <w:rPr>
+          <w:highlight w:val="yellow"/>
+          <w:lang w:val="fr-CH"/>
+        </w:rPr>
+        <w:t>]&gt;&gt;</w:t>
       </w:r>
       <w:r>
         <w:rPr>
@@ -2289,7 +3814,23 @@
                         <w:txbxContent>
                           <w:p>
                             <w:r>
-                              <w:t>&lt;&lt;image [formLetter.senderSignature]&gt;&gt;</w:t>
+                              <w:t>&lt;&lt;</w:t>
+                            </w:r>
+                            <w:proofErr w:type="spellStart"/>
+                            <w:r>
+                              <w:t>image</w:t>
+                            </w:r>
+                            <w:proofErr w:type="spellEnd"/>
+                            <w:r>
+                              <w:t xml:space="preserve"> [</w:t>
+                            </w:r>
+                            <w:proofErr w:type="spellStart"/>
+                            <w:r>
+                              <w:t>formLetter.senderSignature</w:t>
+                            </w:r>
+                            <w:proofErr w:type="spellEnd"/>
+                            <w:r>
+                              <w:t>]&gt;&gt;</w:t>
                             </w:r>
                           </w:p>
                         </w:txbxContent>
@@ -2345,7 +3886,15 @@
           <w:highlight w:val="yellow"/>
           <w:lang w:val="en-US"/>
         </w:rPr>
-        <w:t>&lt;&lt;if [</w:t>
+        <w:t xml:space="preserve">&lt;&lt;if </w:t>
+      </w:r>
+      <w:proofErr w:type="gramStart"/>
+      <w:r>
+        <w:rPr>
+          <w:highlight w:val="yellow"/>
+          <w:lang w:val="en-US"/>
+        </w:rPr>
+        <w:t>[</w:t>
       </w:r>
       <w:r>
         <w:rPr>
@@ -2354,12 +3903,22 @@
         </w:rPr>
         <w:t>!</w:t>
       </w:r>
-      <w:r>
-        <w:rPr>
-          <w:highlight w:val="yellow"/>
-          <w:lang w:val="en-US"/>
-        </w:rPr>
-        <w:t>formLetter.hasSignature]&gt;&gt;</w:t>
+      <w:proofErr w:type="spellStart"/>
+      <w:r>
+        <w:rPr>
+          <w:highlight w:val="yellow"/>
+          <w:lang w:val="en-US"/>
+        </w:rPr>
+        <w:t>formLetter.hasSignature</w:t>
+      </w:r>
+      <w:proofErr w:type="spellEnd"/>
+      <w:proofErr w:type="gramEnd"/>
+      <w:r>
+        <w:rPr>
+          <w:highlight w:val="yellow"/>
+          <w:lang w:val="en-US"/>
+        </w:rPr>
+        <w:t>]&gt;&gt;</w:t>
       </w:r>
     </w:p>
     <w:p>
@@ -2404,6 +3963,8 @@
         </w:rPr>
         <w:t>&lt;&lt;[</w:t>
       </w:r>
+      <w:proofErr w:type="spellStart"/>
+      <w:proofErr w:type="gramStart"/>
       <w:r>
         <w:rPr>
           <w:lang w:val="en-US"/>
@@ -2414,7 +3975,15 @@
         <w:rPr>
           <w:lang w:val="en-US"/>
         </w:rPr>
-        <w:t>.senderName]&gt;&gt;</w:t>
+        <w:t>.senderName</w:t>
+      </w:r>
+      <w:proofErr w:type="spellEnd"/>
+      <w:proofErr w:type="gramEnd"/>
+      <w:r>
+        <w:rPr>
+          <w:lang w:val="en-US"/>
+        </w:rPr>
+        <w:t>]&gt;&gt;</w:t>
       </w:r>
     </w:p>
     <w:p>
@@ -2429,6 +3998,8 @@
         </w:rPr>
         <w:t>&lt;&lt;[</w:t>
       </w:r>
+      <w:proofErr w:type="spellStart"/>
+      <w:proofErr w:type="gramStart"/>
       <w:r>
         <w:rPr>
           <w:lang w:val="en-US"/>
@@ -2439,7 +4010,15 @@
         <w:rPr>
           <w:lang w:val="en-US"/>
         </w:rPr>
-        <w:t>.senderFunction]&gt;&gt;</w:t>
+        <w:t>.senderFunction</w:t>
+      </w:r>
+      <w:proofErr w:type="spellEnd"/>
+      <w:proofErr w:type="gramEnd"/>
+      <w:r>
+        <w:rPr>
+          <w:lang w:val="en-US"/>
+        </w:rPr>
+        <w:t>]&gt;&gt;</w:t>
       </w:r>
     </w:p>
     <w:p>
@@ -2459,7 +4038,7 @@
     </w:p>
     <w:p>
       <w:pPr>
-        <w:pStyle w:val="Listenabsatz"/>
+        <w:pStyle w:val="ListParagraph"/>
         <w:ind w:left="0"/>
         <w:rPr>
           <w:rFonts w:eastAsia="Times New Roman" w:cs="Times New Roman"/>
@@ -2538,7 +4117,7 @@
         </w:tcPr>
         <w:p>
           <w:pPr>
-            <w:pStyle w:val="Fuzeile"/>
+            <w:pStyle w:val="Footer"/>
           </w:pPr>
         </w:p>
       </w:tc>
@@ -2549,7 +4128,7 @@
         </w:tcPr>
         <w:p>
           <w:pPr>
-            <w:pStyle w:val="Fuzeile"/>
+            <w:pStyle w:val="Footer"/>
           </w:pPr>
           <w:r>
             <w:t>&lt;&lt;[formLetter.senderOffice]&gt;&gt;</w:t>
@@ -2557,7 +4136,7 @@
         </w:p>
         <w:p>
           <w:pPr>
-            <w:pStyle w:val="Fuzeile"/>
+            <w:pStyle w:val="Footer"/>
           </w:pPr>
           <w:r>
             <w:t>&lt;&lt;[formLetter.senderName]&gt;&gt;</w:t>
@@ -2565,7 +4144,7 @@
         </w:p>
         <w:p>
           <w:pPr>
-            <w:pStyle w:val="Fuzeile"/>
+            <w:pStyle w:val="Footer"/>
           </w:pPr>
           <w:r>
             <w:t>&lt;&lt;[formLetter.senderStreet]&gt;&gt;, CH-&lt;&lt;[formLetter.senderZip]&gt;&gt; &lt;&lt;[formLetter.senderCity]&gt;&gt;</w:t>
@@ -2573,7 +4152,7 @@
         </w:p>
         <w:p>
           <w:pPr>
-            <w:pStyle w:val="Fuzeile"/>
+            <w:pStyle w:val="Footer"/>
           </w:pPr>
           <w:r>
             <w:t>&lt;&lt;[formLetter.sender</w:t>
@@ -2587,7 +4166,7 @@
         </w:p>
         <w:p>
           <w:pPr>
-            <w:pStyle w:val="Fuzeile"/>
+            <w:pStyle w:val="Footer"/>
           </w:pPr>
           <w:r>
             <w:t>&lt;&lt;[formLetter.sender</w:t>
@@ -2601,7 +4180,7 @@
         </w:p>
         <w:p>
           <w:pPr>
-            <w:pStyle w:val="Fuzeile"/>
+            <w:pStyle w:val="Footer"/>
           </w:pPr>
           <w:r>
             <w:t>&lt;&lt;[formLetter.senderWebsite]&gt;&gt;</w:t>
@@ -2630,7 +4209,7 @@
   </w:tbl>
   <w:p>
     <w:pPr>
-      <w:pStyle w:val="Fuzeile"/>
+      <w:pStyle w:val="Footer"/>
     </w:pPr>
   </w:p>
 </w:ftr>
@@ -2658,7 +4237,7 @@
         </w:tcPr>
         <w:p>
           <w:pPr>
-            <w:pStyle w:val="Fuzeile"/>
+            <w:pStyle w:val="Footer"/>
           </w:pPr>
         </w:p>
       </w:tc>
@@ -2669,7 +4248,7 @@
         </w:tcPr>
         <w:p>
           <w:pPr>
-            <w:pStyle w:val="Fuzeile"/>
+            <w:pStyle w:val="Footer"/>
           </w:pPr>
           <w:r>
             <w:t>&lt;&lt;[</w:t>
@@ -2683,7 +4262,7 @@
         </w:p>
         <w:p>
           <w:pPr>
-            <w:pStyle w:val="Fuzeile"/>
+            <w:pStyle w:val="Footer"/>
           </w:pPr>
           <w:r>
             <w:t>&lt;&lt;[</w:t>
@@ -2697,7 +4276,7 @@
         </w:p>
         <w:p>
           <w:pPr>
-            <w:pStyle w:val="Fuzeile"/>
+            <w:pStyle w:val="Footer"/>
           </w:pPr>
           <w:r>
             <w:t>&lt;&lt;[</w:t>
@@ -2717,7 +4296,7 @@
         </w:p>
         <w:p>
           <w:pPr>
-            <w:pStyle w:val="Fuzeile"/>
+            <w:pStyle w:val="Footer"/>
           </w:pPr>
           <w:r>
             <w:t>&lt;&lt;[</w:t>
@@ -2752,7 +4331,7 @@
   </w:tbl>
   <w:p>
     <w:pPr>
-      <w:pStyle w:val="Fuzeile"/>
+      <w:pStyle w:val="Footer"/>
     </w:pPr>
   </w:p>
 </w:ftr>
@@ -2789,7 +4368,7 @@
   </w:p>
   <w:p>
     <w:pPr>
-      <w:pStyle w:val="Kopfzeile"/>
+      <w:pStyle w:val="Header"/>
       <w:rPr>
         <w:lang w:val="en-US"/>
       </w:rPr>
@@ -3195,7 +4774,7 @@
     <w:lsdException w:name="Unresolved Mention" w:semiHidden="1" w:unhideWhenUsed="1"/>
     <w:lsdException w:name="Smart Link" w:semiHidden="1" w:unhideWhenUsed="1"/>
   </w:latentStyles>
-  <w:style w:type="paragraph" w:default="1" w:styleId="Standard">
+  <w:style w:type="paragraph" w:default="1" w:styleId="Normal">
     <w:name w:val="Normal"/>
     <w:qFormat/>
     <w:rsid w:val="00A53EA2"/>
@@ -3211,11 +4790,11 @@
       <w14:ligatures w14:val="none"/>
     </w:rPr>
   </w:style>
-  <w:style w:type="paragraph" w:styleId="berschrift1">
+  <w:style w:type="paragraph" w:styleId="Heading1">
     <w:name w:val="heading 1"/>
-    <w:basedOn w:val="Standard"/>
-    <w:next w:val="Standard"/>
-    <w:link w:val="berschrift1Zchn"/>
+    <w:basedOn w:val="Normal"/>
+    <w:next w:val="Normal"/>
+    <w:link w:val="Heading1Char"/>
     <w:uiPriority w:val="9"/>
     <w:qFormat/>
     <w:rsid w:val="00D23B4B"/>
@@ -3235,11 +4814,11 @@
       <w14:ligatures w14:val="standardContextual"/>
     </w:rPr>
   </w:style>
-  <w:style w:type="paragraph" w:styleId="berschrift2">
+  <w:style w:type="paragraph" w:styleId="Heading2">
     <w:name w:val="heading 2"/>
-    <w:basedOn w:val="Standard"/>
-    <w:next w:val="Standard"/>
-    <w:link w:val="berschrift2Zchn"/>
+    <w:basedOn w:val="Normal"/>
+    <w:next w:val="Normal"/>
+    <w:link w:val="Heading2Char"/>
     <w:uiPriority w:val="9"/>
     <w:semiHidden/>
     <w:unhideWhenUsed/>
@@ -3261,11 +4840,11 @@
       <w14:ligatures w14:val="standardContextual"/>
     </w:rPr>
   </w:style>
-  <w:style w:type="paragraph" w:styleId="berschrift3">
+  <w:style w:type="paragraph" w:styleId="Heading3">
     <w:name w:val="heading 3"/>
-    <w:basedOn w:val="Standard"/>
-    <w:next w:val="Standard"/>
-    <w:link w:val="berschrift3Zchn"/>
+    <w:basedOn w:val="Normal"/>
+    <w:next w:val="Normal"/>
+    <w:link w:val="Heading3Char"/>
     <w:uiPriority w:val="9"/>
     <w:semiHidden/>
     <w:unhideWhenUsed/>
@@ -3287,11 +4866,11 @@
       <w14:ligatures w14:val="standardContextual"/>
     </w:rPr>
   </w:style>
-  <w:style w:type="paragraph" w:styleId="berschrift4">
+  <w:style w:type="paragraph" w:styleId="Heading4">
     <w:name w:val="heading 4"/>
-    <w:basedOn w:val="Standard"/>
-    <w:next w:val="Standard"/>
-    <w:link w:val="berschrift4Zchn"/>
+    <w:basedOn w:val="Normal"/>
+    <w:next w:val="Normal"/>
+    <w:link w:val="Heading4Char"/>
     <w:uiPriority w:val="9"/>
     <w:semiHidden/>
     <w:unhideWhenUsed/>
@@ -3315,11 +4894,11 @@
       <w14:ligatures w14:val="standardContextual"/>
     </w:rPr>
   </w:style>
-  <w:style w:type="paragraph" w:styleId="berschrift5">
+  <w:style w:type="paragraph" w:styleId="Heading5">
     <w:name w:val="heading 5"/>
-    <w:basedOn w:val="Standard"/>
-    <w:next w:val="Standard"/>
-    <w:link w:val="berschrift5Zchn"/>
+    <w:basedOn w:val="Normal"/>
+    <w:next w:val="Normal"/>
+    <w:link w:val="Heading5Char"/>
     <w:uiPriority w:val="9"/>
     <w:semiHidden/>
     <w:unhideWhenUsed/>
@@ -3341,11 +4920,11 @@
       <w14:ligatures w14:val="standardContextual"/>
     </w:rPr>
   </w:style>
-  <w:style w:type="paragraph" w:styleId="berschrift6">
+  <w:style w:type="paragraph" w:styleId="Heading6">
     <w:name w:val="heading 6"/>
-    <w:basedOn w:val="Standard"/>
-    <w:next w:val="Standard"/>
-    <w:link w:val="berschrift6Zchn"/>
+    <w:basedOn w:val="Normal"/>
+    <w:next w:val="Normal"/>
+    <w:link w:val="Heading6Char"/>
     <w:uiPriority w:val="9"/>
     <w:semiHidden/>
     <w:unhideWhenUsed/>
@@ -3369,11 +4948,11 @@
       <w14:ligatures w14:val="standardContextual"/>
     </w:rPr>
   </w:style>
-  <w:style w:type="paragraph" w:styleId="berschrift7">
+  <w:style w:type="paragraph" w:styleId="Heading7">
     <w:name w:val="heading 7"/>
-    <w:basedOn w:val="Standard"/>
-    <w:next w:val="Standard"/>
-    <w:link w:val="berschrift7Zchn"/>
+    <w:basedOn w:val="Normal"/>
+    <w:next w:val="Normal"/>
+    <w:link w:val="Heading7Char"/>
     <w:uiPriority w:val="9"/>
     <w:semiHidden/>
     <w:unhideWhenUsed/>
@@ -3395,11 +4974,11 @@
       <w14:ligatures w14:val="standardContextual"/>
     </w:rPr>
   </w:style>
-  <w:style w:type="paragraph" w:styleId="berschrift8">
+  <w:style w:type="paragraph" w:styleId="Heading8">
     <w:name w:val="heading 8"/>
-    <w:basedOn w:val="Standard"/>
-    <w:next w:val="Standard"/>
-    <w:link w:val="berschrift8Zchn"/>
+    <w:basedOn w:val="Normal"/>
+    <w:next w:val="Normal"/>
+    <w:link w:val="Heading8Char"/>
     <w:uiPriority w:val="9"/>
     <w:semiHidden/>
     <w:unhideWhenUsed/>
@@ -3423,11 +5002,11 @@
       <w14:ligatures w14:val="standardContextual"/>
     </w:rPr>
   </w:style>
-  <w:style w:type="paragraph" w:styleId="berschrift9">
+  <w:style w:type="paragraph" w:styleId="Heading9">
     <w:name w:val="heading 9"/>
-    <w:basedOn w:val="Standard"/>
-    <w:next w:val="Standard"/>
-    <w:link w:val="berschrift9Zchn"/>
+    <w:basedOn w:val="Normal"/>
+    <w:next w:val="Normal"/>
+    <w:link w:val="Heading9Char"/>
     <w:uiPriority w:val="9"/>
     <w:semiHidden/>
     <w:unhideWhenUsed/>
@@ -3449,12 +5028,13 @@
       <w14:ligatures w14:val="standardContextual"/>
     </w:rPr>
   </w:style>
-  <w:style w:type="character" w:default="1" w:styleId="Absatz-Standardschriftart">
+  <w:style w:type="character" w:default="1" w:styleId="DefaultParagraphFont">
     <w:name w:val="Default Paragraph Font"/>
     <w:uiPriority w:val="1"/>
+    <w:semiHidden/>
     <w:unhideWhenUsed/>
   </w:style>
-  <w:style w:type="table" w:default="1" w:styleId="NormaleTabelle">
+  <w:style w:type="table" w:default="1" w:styleId="TableNormal">
     <w:name w:val="Normal Table"/>
     <w:uiPriority w:val="99"/>
     <w:semiHidden/>
@@ -3469,16 +5049,16 @@
       </w:tblCellMar>
     </w:tblPr>
   </w:style>
-  <w:style w:type="numbering" w:default="1" w:styleId="KeineListe">
+  <w:style w:type="numbering" w:default="1" w:styleId="NoList">
     <w:name w:val="No List"/>
     <w:uiPriority w:val="99"/>
     <w:semiHidden/>
     <w:unhideWhenUsed/>
   </w:style>
-  <w:style w:type="character" w:customStyle="1" w:styleId="berschrift1Zchn">
-    <w:name w:val="Überschrift 1 Zchn"/>
-    <w:basedOn w:val="Absatz-Standardschriftart"/>
-    <w:link w:val="berschrift1"/>
+  <w:style w:type="character" w:customStyle="1" w:styleId="Heading1Char">
+    <w:name w:val="Heading 1 Char"/>
+    <w:basedOn w:val="DefaultParagraphFont"/>
+    <w:link w:val="Heading1"/>
     <w:uiPriority w:val="9"/>
     <w:rsid w:val="00D23B4B"/>
     <w:rPr>
@@ -3488,10 +5068,10 @@
       <w:szCs w:val="40"/>
     </w:rPr>
   </w:style>
-  <w:style w:type="character" w:customStyle="1" w:styleId="berschrift2Zchn">
-    <w:name w:val="Überschrift 2 Zchn"/>
-    <w:basedOn w:val="Absatz-Standardschriftart"/>
-    <w:link w:val="berschrift2"/>
+  <w:style w:type="character" w:customStyle="1" w:styleId="Heading2Char">
+    <w:name w:val="Heading 2 Char"/>
+    <w:basedOn w:val="DefaultParagraphFont"/>
+    <w:link w:val="Heading2"/>
     <w:uiPriority w:val="9"/>
     <w:semiHidden/>
     <w:rsid w:val="00D23B4B"/>
@@ -3502,10 +5082,10 @@
       <w:szCs w:val="32"/>
     </w:rPr>
   </w:style>
-  <w:style w:type="character" w:customStyle="1" w:styleId="berschrift3Zchn">
-    <w:name w:val="Überschrift 3 Zchn"/>
-    <w:basedOn w:val="Absatz-Standardschriftart"/>
-    <w:link w:val="berschrift3"/>
+  <w:style w:type="character" w:customStyle="1" w:styleId="Heading3Char">
+    <w:name w:val="Heading 3 Char"/>
+    <w:basedOn w:val="DefaultParagraphFont"/>
+    <w:link w:val="Heading3"/>
     <w:uiPriority w:val="9"/>
     <w:semiHidden/>
     <w:rsid w:val="00D23B4B"/>
@@ -3516,10 +5096,10 @@
       <w:szCs w:val="28"/>
     </w:rPr>
   </w:style>
-  <w:style w:type="character" w:customStyle="1" w:styleId="berschrift4Zchn">
-    <w:name w:val="Überschrift 4 Zchn"/>
-    <w:basedOn w:val="Absatz-Standardschriftart"/>
-    <w:link w:val="berschrift4"/>
+  <w:style w:type="character" w:customStyle="1" w:styleId="Heading4Char">
+    <w:name w:val="Heading 4 Char"/>
+    <w:basedOn w:val="DefaultParagraphFont"/>
+    <w:link w:val="Heading4"/>
     <w:uiPriority w:val="9"/>
     <w:semiHidden/>
     <w:rsid w:val="00D23B4B"/>
@@ -3530,10 +5110,10 @@
       <w:color w:val="0F4761" w:themeColor="accent1" w:themeShade="BF"/>
     </w:rPr>
   </w:style>
-  <w:style w:type="character" w:customStyle="1" w:styleId="berschrift5Zchn">
-    <w:name w:val="Überschrift 5 Zchn"/>
-    <w:basedOn w:val="Absatz-Standardschriftart"/>
-    <w:link w:val="berschrift5"/>
+  <w:style w:type="character" w:customStyle="1" w:styleId="Heading5Char">
+    <w:name w:val="Heading 5 Char"/>
+    <w:basedOn w:val="DefaultParagraphFont"/>
+    <w:link w:val="Heading5"/>
     <w:uiPriority w:val="9"/>
     <w:semiHidden/>
     <w:rsid w:val="00D23B4B"/>
@@ -3542,10 +5122,10 @@
       <w:color w:val="0F4761" w:themeColor="accent1" w:themeShade="BF"/>
     </w:rPr>
   </w:style>
-  <w:style w:type="character" w:customStyle="1" w:styleId="berschrift6Zchn">
-    <w:name w:val="Überschrift 6 Zchn"/>
-    <w:basedOn w:val="Absatz-Standardschriftart"/>
-    <w:link w:val="berschrift6"/>
+  <w:style w:type="character" w:customStyle="1" w:styleId="Heading6Char">
+    <w:name w:val="Heading 6 Char"/>
+    <w:basedOn w:val="DefaultParagraphFont"/>
+    <w:link w:val="Heading6"/>
     <w:uiPriority w:val="9"/>
     <w:semiHidden/>
     <w:rsid w:val="00D23B4B"/>
@@ -3556,10 +5136,10 @@
       <w:color w:val="595959" w:themeColor="text1" w:themeTint="A6"/>
     </w:rPr>
   </w:style>
-  <w:style w:type="character" w:customStyle="1" w:styleId="berschrift7Zchn">
-    <w:name w:val="Überschrift 7 Zchn"/>
-    <w:basedOn w:val="Absatz-Standardschriftart"/>
-    <w:link w:val="berschrift7"/>
+  <w:style w:type="character" w:customStyle="1" w:styleId="Heading7Char">
+    <w:name w:val="Heading 7 Char"/>
+    <w:basedOn w:val="DefaultParagraphFont"/>
+    <w:link w:val="Heading7"/>
     <w:uiPriority w:val="9"/>
     <w:semiHidden/>
     <w:rsid w:val="00D23B4B"/>
@@ -3568,10 +5148,10 @@
       <w:color w:val="595959" w:themeColor="text1" w:themeTint="A6"/>
     </w:rPr>
   </w:style>
-  <w:style w:type="character" w:customStyle="1" w:styleId="berschrift8Zchn">
-    <w:name w:val="Überschrift 8 Zchn"/>
-    <w:basedOn w:val="Absatz-Standardschriftart"/>
-    <w:link w:val="berschrift8"/>
+  <w:style w:type="character" w:customStyle="1" w:styleId="Heading8Char">
+    <w:name w:val="Heading 8 Char"/>
+    <w:basedOn w:val="DefaultParagraphFont"/>
+    <w:link w:val="Heading8"/>
     <w:uiPriority w:val="9"/>
     <w:semiHidden/>
     <w:rsid w:val="00D23B4B"/>
@@ -3582,10 +5162,10 @@
       <w:color w:val="272727" w:themeColor="text1" w:themeTint="D8"/>
     </w:rPr>
   </w:style>
-  <w:style w:type="character" w:customStyle="1" w:styleId="berschrift9Zchn">
-    <w:name w:val="Überschrift 9 Zchn"/>
-    <w:basedOn w:val="Absatz-Standardschriftart"/>
-    <w:link w:val="berschrift9"/>
+  <w:style w:type="character" w:customStyle="1" w:styleId="Heading9Char">
+    <w:name w:val="Heading 9 Char"/>
+    <w:basedOn w:val="DefaultParagraphFont"/>
+    <w:link w:val="Heading9"/>
     <w:uiPriority w:val="9"/>
     <w:semiHidden/>
     <w:rsid w:val="00D23B4B"/>
@@ -3594,11 +5174,11 @@
       <w:color w:val="272727" w:themeColor="text1" w:themeTint="D8"/>
     </w:rPr>
   </w:style>
-  <w:style w:type="paragraph" w:styleId="Titel">
+  <w:style w:type="paragraph" w:styleId="Title">
     <w:name w:val="Title"/>
-    <w:basedOn w:val="Standard"/>
-    <w:next w:val="Standard"/>
-    <w:link w:val="TitelZchn"/>
+    <w:basedOn w:val="Normal"/>
+    <w:next w:val="Normal"/>
+    <w:link w:val="TitleChar"/>
     <w:uiPriority w:val="10"/>
     <w:qFormat/>
     <w:rsid w:val="00D23B4B"/>
@@ -3616,10 +5196,10 @@
       <w14:ligatures w14:val="standardContextual"/>
     </w:rPr>
   </w:style>
-  <w:style w:type="character" w:customStyle="1" w:styleId="TitelZchn">
-    <w:name w:val="Titel Zchn"/>
-    <w:basedOn w:val="Absatz-Standardschriftart"/>
-    <w:link w:val="Titel"/>
+  <w:style w:type="character" w:customStyle="1" w:styleId="TitleChar">
+    <w:name w:val="Title Char"/>
+    <w:basedOn w:val="DefaultParagraphFont"/>
+    <w:link w:val="Title"/>
     <w:uiPriority w:val="10"/>
     <w:rsid w:val="00D23B4B"/>
     <w:rPr>
@@ -3630,11 +5210,11 @@
       <w:szCs w:val="56"/>
     </w:rPr>
   </w:style>
-  <w:style w:type="paragraph" w:styleId="Untertitel">
+  <w:style w:type="paragraph" w:styleId="Subtitle">
     <w:name w:val="Subtitle"/>
-    <w:basedOn w:val="Standard"/>
-    <w:next w:val="Standard"/>
-    <w:link w:val="UntertitelZchn"/>
+    <w:basedOn w:val="Normal"/>
+    <w:next w:val="Normal"/>
+    <w:link w:val="SubtitleChar"/>
     <w:uiPriority w:val="11"/>
     <w:qFormat/>
     <w:rsid w:val="00D23B4B"/>
@@ -3655,10 +5235,10 @@
       <w14:ligatures w14:val="standardContextual"/>
     </w:rPr>
   </w:style>
-  <w:style w:type="character" w:customStyle="1" w:styleId="UntertitelZchn">
-    <w:name w:val="Untertitel Zchn"/>
-    <w:basedOn w:val="Absatz-Standardschriftart"/>
-    <w:link w:val="Untertitel"/>
+  <w:style w:type="character" w:customStyle="1" w:styleId="SubtitleChar">
+    <w:name w:val="Subtitle Char"/>
+    <w:basedOn w:val="DefaultParagraphFont"/>
+    <w:link w:val="Subtitle"/>
     <w:uiPriority w:val="11"/>
     <w:rsid w:val="00D23B4B"/>
     <w:rPr>
@@ -3669,11 +5249,11 @@
       <w:szCs w:val="28"/>
     </w:rPr>
   </w:style>
-  <w:style w:type="paragraph" w:styleId="Zitat">
+  <w:style w:type="paragraph" w:styleId="Quote">
     <w:name w:val="Quote"/>
-    <w:basedOn w:val="Standard"/>
-    <w:next w:val="Standard"/>
-    <w:link w:val="ZitatZchn"/>
+    <w:basedOn w:val="Normal"/>
+    <w:next w:val="Normal"/>
+    <w:link w:val="QuoteChar"/>
     <w:uiPriority w:val="29"/>
     <w:qFormat/>
     <w:rsid w:val="00D23B4B"/>
@@ -3693,10 +5273,10 @@
       <w14:ligatures w14:val="standardContextual"/>
     </w:rPr>
   </w:style>
-  <w:style w:type="character" w:customStyle="1" w:styleId="ZitatZchn">
-    <w:name w:val="Zitat Zchn"/>
-    <w:basedOn w:val="Absatz-Standardschriftart"/>
-    <w:link w:val="Zitat"/>
+  <w:style w:type="character" w:customStyle="1" w:styleId="QuoteChar">
+    <w:name w:val="Quote Char"/>
+    <w:basedOn w:val="DefaultParagraphFont"/>
+    <w:link w:val="Quote"/>
     <w:uiPriority w:val="29"/>
     <w:rsid w:val="00D23B4B"/>
     <w:rPr>
@@ -3706,9 +5286,9 @@
       <w:color w:val="404040" w:themeColor="text1" w:themeTint="BF"/>
     </w:rPr>
   </w:style>
-  <w:style w:type="paragraph" w:styleId="Listenabsatz">
+  <w:style w:type="paragraph" w:styleId="ListParagraph">
     <w:name w:val="List Paragraph"/>
-    <w:basedOn w:val="Standard"/>
+    <w:basedOn w:val="Normal"/>
     <w:uiPriority w:val="34"/>
     <w:qFormat/>
     <w:rsid w:val="00D23B4B"/>
@@ -3726,9 +5306,9 @@
       <w14:ligatures w14:val="standardContextual"/>
     </w:rPr>
   </w:style>
-  <w:style w:type="character" w:styleId="IntensiveHervorhebung">
+  <w:style w:type="character" w:styleId="IntenseEmphasis">
     <w:name w:val="Intense Emphasis"/>
-    <w:basedOn w:val="Absatz-Standardschriftart"/>
+    <w:basedOn w:val="DefaultParagraphFont"/>
     <w:uiPriority w:val="21"/>
     <w:qFormat/>
     <w:rsid w:val="00D23B4B"/>
@@ -3738,11 +5318,11 @@
       <w:color w:val="0F4761" w:themeColor="accent1" w:themeShade="BF"/>
     </w:rPr>
   </w:style>
-  <w:style w:type="paragraph" w:styleId="IntensivesZitat">
+  <w:style w:type="paragraph" w:styleId="IntenseQuote">
     <w:name w:val="Intense Quote"/>
-    <w:basedOn w:val="Standard"/>
-    <w:next w:val="Standard"/>
-    <w:link w:val="IntensivesZitatZchn"/>
+    <w:basedOn w:val="Normal"/>
+    <w:next w:val="Normal"/>
+    <w:link w:val="IntenseQuoteChar"/>
     <w:uiPriority w:val="30"/>
     <w:qFormat/>
     <w:rsid w:val="00D23B4B"/>
@@ -3767,10 +5347,10 @@
       <w14:ligatures w14:val="standardContextual"/>
     </w:rPr>
   </w:style>
-  <w:style w:type="character" w:customStyle="1" w:styleId="IntensivesZitatZchn">
-    <w:name w:val="Intensives Zitat Zchn"/>
-    <w:basedOn w:val="Absatz-Standardschriftart"/>
-    <w:link w:val="IntensivesZitat"/>
+  <w:style w:type="character" w:customStyle="1" w:styleId="IntenseQuoteChar">
+    <w:name w:val="Intense Quote Char"/>
+    <w:basedOn w:val="DefaultParagraphFont"/>
+    <w:link w:val="IntenseQuote"/>
     <w:uiPriority w:val="30"/>
     <w:rsid w:val="00D23B4B"/>
     <w:rPr>
@@ -3780,9 +5360,9 @@
       <w:color w:val="0F4761" w:themeColor="accent1" w:themeShade="BF"/>
     </w:rPr>
   </w:style>
-  <w:style w:type="character" w:styleId="IntensiverVerweis">
+  <w:style w:type="character" w:styleId="IntenseReference">
     <w:name w:val="Intense Reference"/>
-    <w:basedOn w:val="Absatz-Standardschriftart"/>
+    <w:basedOn w:val="DefaultParagraphFont"/>
     <w:uiPriority w:val="32"/>
     <w:qFormat/>
     <w:rsid w:val="00D23B4B"/>
@@ -3794,10 +5374,10 @@
       <w:spacing w:val="5"/>
     </w:rPr>
   </w:style>
-  <w:style w:type="paragraph" w:styleId="Fuzeile">
+  <w:style w:type="paragraph" w:styleId="Footer">
     <w:name w:val="footer"/>
-    <w:basedOn w:val="Standard"/>
-    <w:link w:val="FuzeileZchn"/>
+    <w:basedOn w:val="Normal"/>
+    <w:link w:val="FooterChar"/>
     <w:rsid w:val="00D23B4B"/>
     <w:pPr>
       <w:suppressAutoHyphens/>
@@ -3809,10 +5389,10 @@
       <w:szCs w:val="15"/>
     </w:rPr>
   </w:style>
-  <w:style w:type="character" w:customStyle="1" w:styleId="FuzeileZchn">
-    <w:name w:val="Fußzeile Zchn"/>
-    <w:basedOn w:val="Absatz-Standardschriftart"/>
-    <w:link w:val="Fuzeile"/>
+  <w:style w:type="character" w:customStyle="1" w:styleId="FooterChar">
+    <w:name w:val="Footer Char"/>
+    <w:basedOn w:val="DefaultParagraphFont"/>
+    <w:link w:val="Footer"/>
     <w:rsid w:val="00D23B4B"/>
     <w:rPr>
       <w:rFonts w:ascii="Arial" w:eastAsia="Times New Roman" w:hAnsi="Arial" w:cs="Times New Roman"/>
@@ -3824,10 +5404,10 @@
       <w14:ligatures w14:val="none"/>
     </w:rPr>
   </w:style>
-  <w:style w:type="paragraph" w:styleId="Kopfzeile">
+  <w:style w:type="paragraph" w:styleId="Header">
     <w:name w:val="header"/>
-    <w:basedOn w:val="Standard"/>
-    <w:link w:val="KopfzeileZchn"/>
+    <w:basedOn w:val="Normal"/>
+    <w:link w:val="HeaderChar"/>
     <w:rsid w:val="00D23B4B"/>
     <w:pPr>
       <w:suppressAutoHyphens/>
@@ -3838,10 +5418,10 @@
       <w:sz w:val="15"/>
     </w:rPr>
   </w:style>
-  <w:style w:type="character" w:customStyle="1" w:styleId="KopfzeileZchn">
-    <w:name w:val="Kopfzeile Zchn"/>
-    <w:basedOn w:val="Absatz-Standardschriftart"/>
-    <w:link w:val="Kopfzeile"/>
+  <w:style w:type="character" w:customStyle="1" w:styleId="HeaderChar">
+    <w:name w:val="Header Char"/>
+    <w:basedOn w:val="DefaultParagraphFont"/>
+    <w:link w:val="Header"/>
     <w:rsid w:val="00D23B4B"/>
     <w:rPr>
       <w:rFonts w:ascii="Arial" w:eastAsia="Times New Roman" w:hAnsi="Arial" w:cs="Times New Roman"/>
@@ -3871,7 +5451,7 @@
   </w:style>
   <w:style w:type="paragraph" w:customStyle="1" w:styleId="Pfad">
     <w:name w:val="Pfad"/>
-    <w:next w:val="Fuzeile"/>
+    <w:next w:val="Footer"/>
     <w:rsid w:val="00D23B4B"/>
     <w:pPr>
       <w:spacing w:after="0" w:line="160" w:lineRule="exact"/>
@@ -3888,8 +5468,8 @@
   </w:style>
   <w:style w:type="paragraph" w:customStyle="1" w:styleId="Platzhalter">
     <w:name w:val="Platzhalter"/>
-    <w:basedOn w:val="Standard"/>
-    <w:next w:val="Standard"/>
+    <w:basedOn w:val="Normal"/>
+    <w:next w:val="Normal"/>
     <w:rsid w:val="00D23B4B"/>
     <w:rPr>
       <w:sz w:val="2"/>
@@ -3898,8 +5478,8 @@
   </w:style>
   <w:style w:type="paragraph" w:customStyle="1" w:styleId="Ref">
     <w:name w:val="Ref"/>
-    <w:basedOn w:val="Standard"/>
-    <w:next w:val="Standard"/>
+    <w:basedOn w:val="Normal"/>
+    <w:next w:val="Normal"/>
     <w:rsid w:val="00D23B4B"/>
     <w:pPr>
       <w:spacing w:line="200" w:lineRule="exact"/>
@@ -3910,7 +5490,7 @@
   </w:style>
   <w:style w:type="paragraph" w:customStyle="1" w:styleId="Seite">
     <w:name w:val="Seite"/>
-    <w:basedOn w:val="Standard"/>
+    <w:basedOn w:val="Normal"/>
     <w:rsid w:val="00D23B4B"/>
     <w:pPr>
       <w:suppressAutoHyphens/>
@@ -3924,7 +5504,7 @@
   </w:style>
   <w:style w:type="paragraph" w:customStyle="1" w:styleId="Text75-Abstandnach7Pt">
     <w:name w:val="Text 7.5 - Abstand nach 7 Pt."/>
-    <w:basedOn w:val="Standard"/>
+    <w:basedOn w:val="Normal"/>
     <w:link w:val="Text75-Abstandnach7PtZchn"/>
     <w:uiPriority w:val="99"/>
     <w:unhideWhenUsed/>
@@ -3941,7 +5521,7 @@
   </w:style>
   <w:style w:type="character" w:customStyle="1" w:styleId="Text75-Abstandnach7PtZchn">
     <w:name w:val="Text 7.5 - Abstand nach 7 Pt. Zchn"/>
-    <w:basedOn w:val="Absatz-Standardschriftart"/>
+    <w:basedOn w:val="DefaultParagraphFont"/>
     <w:link w:val="Text75-Abstandnach7Pt"/>
     <w:uiPriority w:val="99"/>
     <w:rsid w:val="00D23B4B"/>
@@ -3970,9 +5550,9 @@
       <w14:ligatures w14:val="none"/>
     </w:rPr>
   </w:style>
-  <w:style w:type="table" w:styleId="Tabellenraster">
+  <w:style w:type="table" w:styleId="TableGrid">
     <w:name w:val="Table Grid"/>
-    <w:basedOn w:val="NormaleTabelle"/>
+    <w:basedOn w:val="TableNormal"/>
     <w:uiPriority w:val="39"/>
     <w:rsid w:val="00D23B4B"/>
     <w:pPr>
@@ -4015,7 +5595,7 @@
   </w:style>
   <w:style w:type="character" w:customStyle="1" w:styleId="Text1-Zeilenabstand07ptZchn">
     <w:name w:val="Text 1 - Zeilenabstand 0.7 pt. Zchn"/>
-    <w:basedOn w:val="Absatz-Standardschriftart"/>
+    <w:basedOn w:val="DefaultParagraphFont"/>
     <w:link w:val="Text1-Zeilenabstand07pt"/>
     <w:uiPriority w:val="99"/>
     <w:rsid w:val="00D23B4B"/>
@@ -4029,7 +5609,7 @@
   </w:style>
   <w:style w:type="character" w:customStyle="1" w:styleId="Text7Zchn">
     <w:name w:val="Text 7 Zchn"/>
-    <w:basedOn w:val="Absatz-Standardschriftart"/>
+    <w:basedOn w:val="DefaultParagraphFont"/>
     <w:link w:val="Text7"/>
     <w:uiPriority w:val="99"/>
     <w:rsid w:val="00D23B4B"/>
@@ -4043,7 +5623,7 @@
   </w:style>
   <w:style w:type="character" w:styleId="Hyperlink">
     <w:name w:val="Hyperlink"/>
-    <w:basedOn w:val="Absatz-Standardschriftart"/>
+    <w:basedOn w:val="DefaultParagraphFont"/>
     <w:uiPriority w:val="99"/>
     <w:unhideWhenUsed/>
     <w:rsid w:val="00AB128E"/>
@@ -4052,9 +5632,9 @@
       <w:u w:val="single"/>
     </w:rPr>
   </w:style>
-  <w:style w:type="character" w:styleId="NichtaufgelsteErwhnung">
+  <w:style w:type="character" w:styleId="UnresolvedMention">
     <w:name w:val="Unresolved Mention"/>
-    <w:basedOn w:val="Absatz-Standardschriftart"/>
+    <w:basedOn w:val="DefaultParagraphFont"/>
     <w:uiPriority w:val="99"/>
     <w:semiHidden/>
     <w:unhideWhenUsed/>

</xml_diff>

<commit_message>
feat: soft delete ge data when committee ends #BKDO-5105
</commit_message>
<xml_diff>
--- a/src/Bk.APG.Api/Templates/FormLetterGeneralElection_French.docx
+++ b/src/Bk.APG.Api/Templates/FormLetterGeneralElection_French.docx
@@ -905,6 +905,38 @@
       </w:pPr>
     </w:p>
     <w:p>
+      <w:r>
+        <w:rPr>
+          <w:highlight w:val="yellow"/>
+        </w:rPr>
+        <w:t xml:space="preserve">&lt;&lt;if [member.formLetterType </w:t>
+      </w:r>
+      <w:r>
+        <w:rPr>
+          <w:highlight w:val="yellow"/>
+        </w:rPr>
+        <w:t>!=</w:t>
+      </w:r>
+      <w:r>
+        <w:rPr>
+          <w:highlight w:val="yellow"/>
+        </w:rPr>
+        <w:t xml:space="preserve"> </w:t>
+      </w:r>
+      <w:r>
+        <w:rPr>
+          <w:highlight w:val="yellow"/>
+        </w:rPr>
+        <w:t>5</w:t>
+      </w:r>
+      <w:r>
+        <w:rPr>
+          <w:highlight w:val="yellow"/>
+        </w:rPr>
+        <w:t>]&gt;&gt;</w:t>
+      </w:r>
+    </w:p>
+    <w:p>
       <w:pPr>
         <w:rPr>
           <w:lang w:val="fr-CH"/>
@@ -947,6 +979,20 @@
           <w:lang w:val="fr-CH"/>
         </w:rPr>
       </w:pPr>
+    </w:p>
+    <w:p>
+      <w:pPr>
+        <w:rPr>
+          <w:lang w:val="en-US"/>
+        </w:rPr>
+      </w:pPr>
+      <w:r>
+        <w:rPr>
+          <w:highlight w:val="yellow"/>
+          <w:lang w:val="en-US"/>
+        </w:rPr>
+        <w:t>&lt;&lt;/if&gt;&gt;</w:t>
+      </w:r>
     </w:p>
     <w:p>
       <w:pPr>
@@ -1970,6 +2016,156 @@
     <w:p>
       <w:pPr>
         <w:rPr>
+          <w:lang w:val="fr-CH"/>
+        </w:rPr>
+      </w:pPr>
+      <w:r>
+        <w:rPr>
+          <w:highlight w:val="yellow"/>
+          <w:lang w:val="fr-CH"/>
+        </w:rPr>
+        <w:t>&lt;&lt;if [member.formLetterType == 5]&gt;&gt;</w:t>
+      </w:r>
+      <w:r>
+        <w:rPr>
+          <w:noProof/>
+          <w:lang w:val="fr-CH"/>
+        </w:rPr>
+        <w:t xml:space="preserve"> </w:t>
+      </w:r>
+    </w:p>
+    <w:p>
+      <w:pPr>
+        <w:rPr>
+          <w:lang w:val="fr-CH"/>
+        </w:rPr>
+      </w:pPr>
+      <w:r>
+        <w:rPr>
+          <w:lang w:val="fr-CH"/>
+        </w:rPr>
+        <w:t>Le Conseil fédéral a décidé de dissoudre l’organe suivant avec effet au &lt;&lt;[member.endDate]:"dd.MM.yyyy"&gt;&gt;</w:t>
+      </w:r>
+      <w:r>
+        <w:rPr>
+          <w:lang w:val="fr-CH"/>
+        </w:rPr>
+        <w:t>:</w:t>
+      </w:r>
+    </w:p>
+    <w:p>
+      <w:pPr>
+        <w:rPr>
+          <w:lang w:val="fr-CH"/>
+        </w:rPr>
+      </w:pPr>
+    </w:p>
+    <w:p>
+      <w:pPr>
+        <w:rPr>
+          <w:b/>
+          <w:bCs/>
+          <w:lang w:val="fr-CH"/>
+        </w:rPr>
+      </w:pPr>
+      <w:r>
+        <w:rPr>
+          <w:b/>
+          <w:bCs/>
+          <w:lang w:val="fr-CH"/>
+        </w:rPr>
+        <w:t>&lt;&lt;[member.committeeName]&gt;&gt;</w:t>
+      </w:r>
+    </w:p>
+    <w:p>
+      <w:pPr>
+        <w:rPr>
+          <w:b/>
+          <w:bCs/>
+          <w:lang w:val="fr-CH"/>
+        </w:rPr>
+      </w:pPr>
+    </w:p>
+    <w:p>
+      <w:pPr>
+        <w:rPr>
+          <w:lang w:val="fr-CH"/>
+        </w:rPr>
+      </w:pPr>
+      <w:r>
+        <w:rPr>
+          <w:lang w:val="fr-CH"/>
+        </w:rPr>
+        <w:t xml:space="preserve">En conséquence, il prend acte de la fin de votre mandat en tant que </w:t>
+      </w:r>
+      <w:r>
+        <w:rPr>
+          <w:b/>
+          <w:bCs/>
+          <w:lang w:val="fr-CH"/>
+        </w:rPr>
+        <w:t>&lt;&lt;[member.function]&gt;&gt;</w:t>
+      </w:r>
+      <w:r>
+        <w:rPr>
+          <w:b/>
+          <w:lang w:val="fr-CH"/>
+        </w:rPr>
+        <w:t xml:space="preserve"> </w:t>
+      </w:r>
+      <w:r>
+        <w:rPr>
+          <w:lang w:val="fr-CH"/>
+        </w:rPr>
+        <w:t>avec effet au &lt;&lt;[member.endDate]:"dd.MM.yyyy"&gt;&gt;</w:t>
+      </w:r>
+      <w:r>
+        <w:rPr>
+          <w:lang w:val="fr-CH"/>
+        </w:rPr>
+        <w:t>.</w:t>
+      </w:r>
+    </w:p>
+    <w:p>
+      <w:pPr>
+        <w:rPr>
+          <w:b/>
+          <w:lang w:val="fr-CH"/>
+        </w:rPr>
+      </w:pPr>
+    </w:p>
+    <w:p>
+      <w:pPr>
+        <w:rPr>
+          <w:bCs/>
+          <w:lang w:val="fr-CH"/>
+        </w:rPr>
+      </w:pPr>
+      <w:r>
+        <w:rPr>
+          <w:bCs/>
+          <w:lang w:val="fr-CH"/>
+        </w:rPr>
+        <w:t>Au nom du Conseil fédéral, je vous adresse mes remerciements sincères pour l’excellent travail que vous avez accompli et je forme les vœux les meilleurs pour votre avenir.</w:t>
+      </w:r>
+    </w:p>
+    <w:p>
+      <w:pPr>
+        <w:rPr>
+          <w:lang w:val="en-US"/>
+        </w:rPr>
+      </w:pPr>
+      <w:r>
+        <w:rPr>
+          <w:highlight w:val="yellow"/>
+          <w:lang w:val="en-US"/>
+        </w:rPr>
+        <w:t>&lt;&lt;/if&gt;&gt;</w:t>
+      </w:r>
+    </w:p>
+    <w:p>
+      <w:pPr>
+        <w:rPr>
           <w:lang w:val="en-US"/>
         </w:rPr>
       </w:pPr>
@@ -2080,6 +2276,7 @@
         <w:rPr>
           <w:lang w:val="fr-CH"/>
         </w:rPr>
+        <w:lastRenderedPageBreak/>
         <w:t>Au nom du Conseil fédéral, je vous adresse mes remerciements sincères pour l’excellent travail que vous avez accompli et je forme les vœux les meilleurs pour votre avenir.</w:t>
       </w:r>
       <w:r>
@@ -2249,7 +2446,6 @@
           <w:highlight w:val="yellow"/>
           <w:lang w:val="fr-CH"/>
         </w:rPr>
-        <w:lastRenderedPageBreak/>
         <w:t>&lt;&lt;if [formLetter.hasSignature]&gt;&gt;</w:t>
       </w:r>
       <w:r>

</xml_diff>